<commit_message>
updating meta-population model - fixing errors leading to NA or NaN
</commit_message>
<xml_diff>
--- a/Docs/Meta-populations.docx
+++ b/Docs/Meta-populations.docx
@@ -295,15 +295,7 @@
         <w:t>Most important is distance</w:t>
       </w:r>
       <w:r>
-        <w:t xml:space="preserve">, others </w:t>
-      </w:r>
-      <w:proofErr w:type="gramStart"/>
-      <w:r>
-        <w:t>factors</w:t>
-      </w:r>
-      <w:proofErr w:type="gramEnd"/>
-      <w:r>
-        <w:t xml:space="preserve"> minimal </w:t>
+        <w:t xml:space="preserve">, others factors minimal </w:t>
       </w:r>
     </w:p>
     <w:p>
@@ -501,6 +493,12 @@
       <w:proofErr w:type="spellEnd"/>
     </w:p>
     <w:p/>
+    <w:p/>
+    <w:p>
+      <w:r>
+        <w:t xml:space="preserve">Why did we change from big mat projection to loops? Need help getting workflow moving. </w:t>
+      </w:r>
+    </w:p>
     <w:sectPr>
       <w:pgSz w:w="11906" w:h="16838"/>
       <w:pgMar w:top="1440" w:right="1440" w:bottom="1440" w:left="1440" w:header="708" w:footer="708" w:gutter="0"/>

</xml_diff>

<commit_message>
Linking density with movement
</commit_message>
<xml_diff>
--- a/Docs/Meta-populations.docx
+++ b/Docs/Meta-populations.docx
@@ -2,6 +2,695 @@
 <file path=word/document.xml><?xml version="1.0" encoding="utf-8"?>
 <w:document xmlns:wpc="http://schemas.microsoft.com/office/word/2010/wordprocessingCanvas" xmlns:cx="http://schemas.microsoft.com/office/drawing/2014/chartex" xmlns:cx1="http://schemas.microsoft.com/office/drawing/2015/9/8/chartex" xmlns:cx2="http://schemas.microsoft.com/office/drawing/2015/10/21/chartex" xmlns:cx3="http://schemas.microsoft.com/office/drawing/2016/5/9/chartex" xmlns:cx4="http://schemas.microsoft.com/office/drawing/2016/5/10/chartex" xmlns:cx5="http://schemas.microsoft.com/office/drawing/2016/5/11/chartex" xmlns:cx6="http://schemas.microsoft.com/office/drawing/2016/5/12/chartex" xmlns:cx7="http://schemas.microsoft.com/office/drawing/2016/5/13/chartex" xmlns:cx8="http://schemas.microsoft.com/office/drawing/2016/5/14/chartex" xmlns:mc="http://schemas.openxmlformats.org/markup-compatibility/2006" xmlns:aink="http://schemas.microsoft.com/office/drawing/2016/ink" xmlns:am3d="http://schemas.microsoft.com/office/drawing/2017/model3d" xmlns:o="urn:schemas-microsoft-com:office:office" xmlns:oel="http://schemas.microsoft.com/office/2019/extlst" xmlns:r="http://schemas.openxmlformats.org/officeDocument/2006/relationships" xmlns:m="http://schemas.openxmlformats.org/officeDocument/2006/math" xmlns:v="urn:schemas-microsoft-com:vml" xmlns:wp14="http://schemas.microsoft.com/office/word/2010/wordprocessingDrawing" xmlns:wp="http://schemas.openxmlformats.org/drawingml/2006/wordprocessingDrawing" xmlns:w10="urn:schemas-microsoft-com:office:word" xmlns:w="http://schemas.openxmlformats.org/wordprocessingml/2006/main" xmlns:w14="http://schemas.microsoft.com/office/word/2010/wordml" xmlns:w15="http://schemas.microsoft.com/office/word/2012/wordml" xmlns:w16cex="http://schemas.microsoft.com/office/word/2018/wordml/cex" xmlns:w16cid="http://schemas.microsoft.com/office/word/2016/wordml/cid" xmlns:w16="http://schemas.microsoft.com/office/word/2018/wordml" xmlns:w16du="http://schemas.microsoft.com/office/word/2023/wordml/word16du" xmlns:w16sdtdh="http://schemas.microsoft.com/office/word/2020/wordml/sdtdatahash" xmlns:w16sdtfl="http://schemas.microsoft.com/office/word/2024/wordml/sdtformatlock" xmlns:w16se="http://schemas.microsoft.com/office/word/2015/wordml/symex" xmlns:wpg="http://schemas.microsoft.com/office/word/2010/wordprocessingGroup" xmlns:wpi="http://schemas.microsoft.com/office/word/2010/wordprocessingInk" xmlns:wne="http://schemas.microsoft.com/office/word/2006/wordml" xmlns:wps="http://schemas.microsoft.com/office/word/2010/wordprocessingShape" mc:Ignorable="w14 w15 w16se w16cid w16 w16cex w16sdtdh w16sdtfl w16du wp14">
   <w:body>
+    <w:p/>
+    <w:p>
+      <w:r>
+        <w:rPr>
+          <w:noProof/>
+        </w:rPr>
+        <mc:AlternateContent>
+          <mc:Choice Requires="wpc">
+            <w:drawing>
+              <wp:inline distT="0" distB="0" distL="0" distR="0" wp14:anchorId="1EF00198" wp14:editId="5FEA10D8">
+                <wp:extent cx="5486400" cy="3200400"/>
+                <wp:effectExtent l="0" t="0" r="0" b="0"/>
+                <wp:docPr id="1736770758" name="Canvas 1"/>
+                <wp:cNvGraphicFramePr>
+                  <a:graphicFrameLocks xmlns:a="http://schemas.openxmlformats.org/drawingml/2006/main" noChangeAspect="1"/>
+                </wp:cNvGraphicFramePr>
+                <a:graphic xmlns:a="http://schemas.openxmlformats.org/drawingml/2006/main">
+                  <a:graphicData uri="http://schemas.microsoft.com/office/word/2010/wordprocessingCanvas">
+                    <wpc:wpc>
+                      <wpc:bg>
+                        <a:solidFill>
+                          <a:prstClr val="white"/>
+                        </a:solidFill>
+                      </wpc:bg>
+                      <wpc:whole/>
+                      <w14:contentPart bwMode="auto" r:id="rId4">
+                        <w14:nvContentPartPr>
+                          <w14:cNvPr id="92477461" name="Ink 92477461"/>
+                          <w14:cNvContentPartPr/>
+                        </w14:nvContentPartPr>
+                        <w14:xfrm>
+                          <a:off x="369620" y="1285087"/>
+                          <a:ext cx="19080" cy="629280"/>
+                        </w14:xfrm>
+                      </w14:contentPart>
+                      <w14:contentPart bwMode="auto" r:id="rId5">
+                        <w14:nvContentPartPr>
+                          <w14:cNvPr id="2077965448" name="Ink 2077965448"/>
+                          <w14:cNvContentPartPr/>
+                        </w14:nvContentPartPr>
+                        <w14:xfrm>
+                          <a:off x="212300" y="699367"/>
+                          <a:ext cx="156240" cy="360360"/>
+                        </w14:xfrm>
+                      </w14:contentPart>
+                      <w14:contentPart bwMode="auto" r:id="rId6">
+                        <w14:nvContentPartPr>
+                          <w14:cNvPr id="779847745" name="Ink 779847745"/>
+                          <w14:cNvContentPartPr/>
+                        </w14:nvContentPartPr>
+                        <w14:xfrm>
+                          <a:off x="188540" y="872527"/>
+                          <a:ext cx="88920" cy="2880"/>
+                        </w14:xfrm>
+                      </w14:contentPart>
+                      <w14:contentPart bwMode="auto" r:id="rId7">
+                        <w14:nvContentPartPr>
+                          <w14:cNvPr id="811176942" name="Ink 811176942"/>
+                          <w14:cNvContentPartPr/>
+                        </w14:nvContentPartPr>
+                        <w14:xfrm>
+                          <a:off x="441260" y="1004647"/>
+                          <a:ext cx="110880" cy="156600"/>
+                        </w14:xfrm>
+                      </w14:contentPart>
+                      <w14:contentPart bwMode="auto" r:id="rId8">
+                        <w14:nvContentPartPr>
+                          <w14:cNvPr id="1344840202" name="Ink 1344840202"/>
+                          <w14:cNvContentPartPr/>
+                        </w14:nvContentPartPr>
+                        <w14:xfrm>
+                          <a:off x="392300" y="1636447"/>
+                          <a:ext cx="4863240" cy="42480"/>
+                        </w14:xfrm>
+                      </w14:contentPart>
+                      <w14:contentPart bwMode="auto" r:id="rId9">
+                        <w14:nvContentPartPr>
+                          <w14:cNvPr id="835747813" name="Ink 835747813"/>
+                          <w14:cNvContentPartPr/>
+                        </w14:nvContentPartPr>
+                        <w14:xfrm>
+                          <a:off x="5240060" y="1383007"/>
+                          <a:ext cx="56880" cy="519480"/>
+                        </w14:xfrm>
+                      </w14:contentPart>
+                      <w14:contentPart bwMode="auto" r:id="rId10">
+                        <w14:nvContentPartPr>
+                          <w14:cNvPr id="104128317" name="Ink 104128317"/>
+                          <w14:cNvContentPartPr/>
+                        </w14:nvContentPartPr>
+                        <w14:xfrm>
+                          <a:off x="5051780" y="872887"/>
+                          <a:ext cx="147600" cy="278280"/>
+                        </w14:xfrm>
+                      </w14:contentPart>
+                      <w14:contentPart bwMode="auto" r:id="rId11">
+                        <w14:nvContentPartPr>
+                          <w14:cNvPr id="1592978462" name="Ink 1592978462"/>
+                          <w14:cNvContentPartPr/>
+                        </w14:nvContentPartPr>
+                        <w14:xfrm>
+                          <a:off x="4975100" y="1007527"/>
+                          <a:ext cx="151200" cy="16920"/>
+                        </w14:xfrm>
+                      </w14:contentPart>
+                      <w14:contentPart bwMode="auto" r:id="rId12">
+                        <w14:nvContentPartPr>
+                          <w14:cNvPr id="101560594" name="Ink 101560594"/>
+                          <w14:cNvContentPartPr/>
+                        </w14:nvContentPartPr>
+                        <w14:xfrm>
+                          <a:off x="5240060" y="1126327"/>
+                          <a:ext cx="71640" cy="103320"/>
+                        </w14:xfrm>
+                      </w14:contentPart>
+                      <w14:contentPart bwMode="auto" r:id="rId13">
+                        <w14:nvContentPartPr>
+                          <w14:cNvPr id="1320656223" name="Ink 1320656223"/>
+                          <w14:cNvContentPartPr/>
+                        </w14:nvContentPartPr>
+                        <w14:xfrm>
+                          <a:off x="5259500" y="1209487"/>
+                          <a:ext cx="86760" cy="17280"/>
+                        </w14:xfrm>
+                      </w14:contentPart>
+                      <w14:contentPart bwMode="auto" r:id="rId14">
+                        <w14:nvContentPartPr>
+                          <w14:cNvPr id="770352982" name="Ink 770352982"/>
+                          <w14:cNvContentPartPr/>
+                        </w14:nvContentPartPr>
+                        <w14:xfrm>
+                          <a:off x="1168460" y="1494967"/>
+                          <a:ext cx="11880" cy="277560"/>
+                        </w14:xfrm>
+                      </w14:contentPart>
+                      <w14:contentPart bwMode="auto" r:id="rId15">
+                        <w14:nvContentPartPr>
+                          <w14:cNvPr id="1267672213" name="Ink 1267672213"/>
+                          <w14:cNvContentPartPr/>
+                        </w14:nvContentPartPr>
+                        <w14:xfrm>
+                          <a:off x="803060" y="1959007"/>
+                          <a:ext cx="107280" cy="169200"/>
+                        </w14:xfrm>
+                      </w14:contentPart>
+                      <w14:contentPart bwMode="auto" r:id="rId16">
+                        <w14:nvContentPartPr>
+                          <w14:cNvPr id="943662521" name="Ink 943662521"/>
+                          <w14:cNvContentPartPr/>
+                        </w14:nvContentPartPr>
+                        <w14:xfrm>
+                          <a:off x="951020" y="2012647"/>
+                          <a:ext cx="79200" cy="154080"/>
+                        </w14:xfrm>
+                      </w14:contentPart>
+                      <w14:contentPart bwMode="auto" r:id="rId17">
+                        <w14:nvContentPartPr>
+                          <w14:cNvPr id="349513586" name="Ink 349513586"/>
+                          <w14:cNvContentPartPr/>
+                        </w14:nvContentPartPr>
+                        <w14:xfrm>
+                          <a:off x="1074140" y="1993927"/>
+                          <a:ext cx="57600" cy="138600"/>
+                        </w14:xfrm>
+                      </w14:contentPart>
+                      <w14:contentPart bwMode="auto" r:id="rId18">
+                        <w14:nvContentPartPr>
+                          <w14:cNvPr id="109883749" name="Ink 109883749"/>
+                          <w14:cNvContentPartPr/>
+                        </w14:nvContentPartPr>
+                        <w14:xfrm>
+                          <a:off x="1160180" y="1978447"/>
+                          <a:ext cx="90720" cy="138960"/>
+                        </w14:xfrm>
+                      </w14:contentPart>
+                      <w14:contentPart bwMode="auto" r:id="rId19">
+                        <w14:nvContentPartPr>
+                          <w14:cNvPr id="1955052069" name="Ink 1955052069"/>
+                          <w14:cNvContentPartPr/>
+                        </w14:nvContentPartPr>
+                        <w14:xfrm>
+                          <a:off x="1744100" y="1607647"/>
+                          <a:ext cx="15120" cy="103680"/>
+                        </w14:xfrm>
+                      </w14:contentPart>
+                      <w14:contentPart bwMode="auto" r:id="rId20">
+                        <w14:nvContentPartPr>
+                          <w14:cNvPr id="260248086" name="Ink 260248086"/>
+                          <w14:cNvContentPartPr/>
+                        </w14:nvContentPartPr>
+                        <w14:xfrm>
+                          <a:off x="1515500" y="1897807"/>
+                          <a:ext cx="84960" cy="179280"/>
+                        </w14:xfrm>
+                      </w14:contentPart>
+                      <w14:contentPart bwMode="auto" r:id="rId21">
+                        <w14:nvContentPartPr>
+                          <w14:cNvPr id="1633593794" name="Ink 1633593794"/>
+                          <w14:cNvContentPartPr/>
+                        </w14:nvContentPartPr>
+                        <w14:xfrm>
+                          <a:off x="1596860" y="1978807"/>
+                          <a:ext cx="203040" cy="115560"/>
+                        </w14:xfrm>
+                      </w14:contentPart>
+                      <w14:contentPart bwMode="auto" r:id="rId22">
+                        <w14:nvContentPartPr>
+                          <w14:cNvPr id="1749567801" name="Ink 1749567801"/>
+                          <w14:cNvContentPartPr/>
+                        </w14:nvContentPartPr>
+                        <w14:xfrm>
+                          <a:off x="1848140" y="1891687"/>
+                          <a:ext cx="99720" cy="197640"/>
+                        </w14:xfrm>
+                      </w14:contentPart>
+                      <w14:contentPart bwMode="auto" r:id="rId23">
+                        <w14:nvContentPartPr>
+                          <w14:cNvPr id="235111432" name="Ink 235111432"/>
+                          <w14:cNvContentPartPr/>
+                        </w14:nvContentPartPr>
+                        <w14:xfrm>
+                          <a:off x="1982060" y="1692247"/>
+                          <a:ext cx="3094560" cy="131760"/>
+                        </w14:xfrm>
+                      </w14:contentPart>
+                      <w14:contentPart bwMode="auto" r:id="rId24">
+                        <w14:nvContentPartPr>
+                          <w14:cNvPr id="1702041107" name="Ink 1702041107"/>
+                          <w14:cNvContentPartPr/>
+                        </w14:nvContentPartPr>
+                        <w14:xfrm>
+                          <a:off x="1996100" y="1669567"/>
+                          <a:ext cx="141120" cy="198720"/>
+                        </w14:xfrm>
+                      </w14:contentPart>
+                      <w14:contentPart bwMode="auto" r:id="rId25">
+                        <w14:nvContentPartPr>
+                          <w14:cNvPr id="322281722" name="Ink 322281722"/>
+                          <w14:cNvContentPartPr/>
+                        </w14:nvContentPartPr>
+                        <w14:xfrm>
+                          <a:off x="2403620" y="2003647"/>
+                          <a:ext cx="199440" cy="180720"/>
+                        </w14:xfrm>
+                      </w14:contentPart>
+                      <w14:contentPart bwMode="auto" r:id="rId26">
+                        <w14:nvContentPartPr>
+                          <w14:cNvPr id="1092419558" name="Ink 1092419558"/>
+                          <w14:cNvContentPartPr/>
+                        </w14:nvContentPartPr>
+                        <w14:xfrm>
+                          <a:off x="2623220" y="2056567"/>
+                          <a:ext cx="227520" cy="137160"/>
+                        </w14:xfrm>
+                      </w14:contentPart>
+                      <w14:contentPart bwMode="auto" r:id="rId27">
+                        <w14:nvContentPartPr>
+                          <w14:cNvPr id="404477437" name="Ink 404477437"/>
+                          <w14:cNvContentPartPr/>
+                        </w14:nvContentPartPr>
+                        <w14:xfrm>
+                          <a:off x="2904380" y="2086807"/>
+                          <a:ext cx="101880" cy="111600"/>
+                        </w14:xfrm>
+                      </w14:contentPart>
+                      <w14:contentPart bwMode="auto" r:id="rId28">
+                        <w14:nvContentPartPr>
+                          <w14:cNvPr id="886082881" name="Ink 886082881"/>
+                          <w14:cNvContentPartPr/>
+                        </w14:nvContentPartPr>
+                        <w14:xfrm>
+                          <a:off x="3039380" y="2146927"/>
+                          <a:ext cx="20880" cy="78120"/>
+                        </w14:xfrm>
+                      </w14:contentPart>
+                      <w14:contentPart bwMode="auto" r:id="rId29">
+                        <w14:nvContentPartPr>
+                          <w14:cNvPr id="1576081196" name="Ink 1576081196"/>
+                          <w14:cNvContentPartPr/>
+                        </w14:nvContentPartPr>
+                        <w14:xfrm>
+                          <a:off x="3059180" y="2022367"/>
+                          <a:ext cx="2880" cy="4320"/>
+                        </w14:xfrm>
+                      </w14:contentPart>
+                      <w14:contentPart bwMode="auto" r:id="rId30">
+                        <w14:nvContentPartPr>
+                          <w14:cNvPr id="1376182977" name="Ink 1376182977"/>
+                          <w14:cNvContentPartPr/>
+                        </w14:nvContentPartPr>
+                        <w14:xfrm>
+                          <a:off x="3078620" y="2096527"/>
+                          <a:ext cx="200520" cy="131040"/>
+                        </w14:xfrm>
+                      </w14:contentPart>
+                      <w14:contentPart bwMode="auto" r:id="rId31">
+                        <w14:nvContentPartPr>
+                          <w14:cNvPr id="1699044281" name="Ink 1699044281"/>
+                          <w14:cNvContentPartPr/>
+                        </w14:nvContentPartPr>
+                        <w14:xfrm>
+                          <a:off x="3362300" y="2012647"/>
+                          <a:ext cx="121680" cy="196200"/>
+                        </w14:xfrm>
+                      </w14:contentPart>
+                      <w14:contentPart bwMode="auto" r:id="rId32">
+                        <w14:nvContentPartPr>
+                          <w14:cNvPr id="154495301" name="Ink 154495301"/>
+                          <w14:cNvContentPartPr/>
+                        </w14:nvContentPartPr>
+                        <w14:xfrm>
+                          <a:off x="3519260" y="2104087"/>
+                          <a:ext cx="134640" cy="82080"/>
+                        </w14:xfrm>
+                      </w14:contentPart>
+                      <w14:contentPart bwMode="auto" r:id="rId33">
+                        <w14:nvContentPartPr>
+                          <w14:cNvPr id="1942467071" name="Ink 1942467071"/>
+                          <w14:cNvContentPartPr/>
+                        </w14:nvContentPartPr>
+                        <w14:xfrm>
+                          <a:off x="3543380" y="2156647"/>
+                          <a:ext cx="147240" cy="286920"/>
+                        </w14:xfrm>
+                      </w14:contentPart>
+                      <w14:contentPart bwMode="auto" r:id="rId34">
+                        <w14:nvContentPartPr>
+                          <w14:cNvPr id="1517664970" name="Ink 1517664970"/>
+                          <w14:cNvContentPartPr/>
+                        </w14:nvContentPartPr>
+                        <w14:xfrm>
+                          <a:off x="3721580" y="2080327"/>
+                          <a:ext cx="78480" cy="95400"/>
+                        </w14:xfrm>
+                      </w14:contentPart>
+                      <w14:contentPart bwMode="auto" r:id="rId35">
+                        <w14:nvContentPartPr>
+                          <w14:cNvPr id="510786032" name="Ink 510786032"/>
+                          <w14:cNvContentPartPr/>
+                        </w14:nvContentPartPr>
+                        <w14:xfrm>
+                          <a:off x="3809780" y="2110207"/>
+                          <a:ext cx="126720" cy="82080"/>
+                        </w14:xfrm>
+                      </w14:contentPart>
+                      <w14:contentPart bwMode="auto" r:id="rId36">
+                        <w14:nvContentPartPr>
+                          <w14:cNvPr id="39819418" name="Ink 39819418"/>
+                          <w14:cNvContentPartPr/>
+                        </w14:nvContentPartPr>
+                        <w14:xfrm>
+                          <a:off x="3969260" y="2038207"/>
+                          <a:ext cx="220680" cy="151200"/>
+                        </w14:xfrm>
+                      </w14:contentPart>
+                      <wps:wsp>
+                        <wps:cNvPr id="75118619" name="Rectangle 75118619"/>
+                        <wps:cNvSpPr/>
+                        <wps:spPr>
+                          <a:xfrm>
+                            <a:off x="736598" y="170202"/>
+                            <a:ext cx="1413935" cy="608732"/>
+                          </a:xfrm>
+                          <a:prstGeom prst="rect">
+                            <a:avLst/>
+                          </a:prstGeom>
+                          <a:noFill/>
+                        </wps:spPr>
+                        <wps:style>
+                          <a:lnRef idx="2">
+                            <a:schemeClr val="accent6"/>
+                          </a:lnRef>
+                          <a:fillRef idx="1">
+                            <a:schemeClr val="lt1"/>
+                          </a:fillRef>
+                          <a:effectRef idx="0">
+                            <a:schemeClr val="accent6"/>
+                          </a:effectRef>
+                          <a:fontRef idx="minor">
+                            <a:schemeClr val="dk1"/>
+                          </a:fontRef>
+                        </wps:style>
+                        <wps:txbx>
+                          <w:txbxContent>
+                            <w:p>
+                              <w:pPr>
+                                <w:jc w:val="center"/>
+                              </w:pPr>
+                              <w:r>
+                                <w:t>Move = dens, sex ratio</w:t>
+                              </w:r>
+                            </w:p>
+                          </w:txbxContent>
+                        </wps:txbx>
+                        <wps:bodyPr rot="0" spcFirstLastPara="0" vertOverflow="overflow" horzOverflow="overflow" vert="horz" wrap="square" lIns="91440" tIns="45720" rIns="91440" bIns="45720" numCol="1" spcCol="0" rtlCol="0" fromWordArt="0" anchor="ctr" anchorCtr="0" forceAA="0" compatLnSpc="1">
+                          <a:prstTxWarp prst="textNoShape">
+                            <a:avLst/>
+                          </a:prstTxWarp>
+                          <a:noAutofit/>
+                        </wps:bodyPr>
+                      </wps:wsp>
+                      <wps:wsp>
+                        <wps:cNvPr id="760750783" name="Rectangle 760750783"/>
+                        <wps:cNvSpPr/>
+                        <wps:spPr>
+                          <a:xfrm>
+                            <a:off x="2484813" y="173835"/>
+                            <a:ext cx="1570355" cy="613410"/>
+                          </a:xfrm>
+                          <a:prstGeom prst="rect">
+                            <a:avLst/>
+                          </a:prstGeom>
+                          <a:noFill/>
+                        </wps:spPr>
+                        <wps:style>
+                          <a:lnRef idx="2">
+                            <a:schemeClr val="accent6"/>
+                          </a:lnRef>
+                          <a:fillRef idx="1">
+                            <a:schemeClr val="lt1"/>
+                          </a:fillRef>
+                          <a:effectRef idx="0">
+                            <a:schemeClr val="accent6"/>
+                          </a:effectRef>
+                          <a:fontRef idx="minor">
+                            <a:schemeClr val="dk1"/>
+                          </a:fontRef>
+                        </wps:style>
+                        <wps:txbx>
+                          <w:txbxContent>
+                            <w:p>
+                              <w:pPr>
+                                <w:spacing w:line="276" w:lineRule="auto"/>
+                                <w:jc w:val="center"/>
+                                <w:rPr>
+                                  <w:rFonts w:eastAsia="Aptos"/>
+                                  <w14:ligatures w14:val="none"/>
+                                </w:rPr>
+                              </w:pPr>
+                              <w:proofErr w:type="gramStart"/>
+                              <w:r>
+                                <w:rPr>
+                                  <w:rFonts w:eastAsia="Aptos"/>
+                                </w:rPr>
+                                <w:t>Breed  =</w:t>
+                              </w:r>
+                              <w:proofErr w:type="gramEnd"/>
+                              <w:r>
+                                <w:rPr>
+                                  <w:rFonts w:eastAsia="Aptos"/>
+                                </w:rPr>
+                                <w:t xml:space="preserve"> </w:t>
+                              </w:r>
+                              <w:r>
+                                <w:rPr>
+                                  <w:rFonts w:eastAsia="Aptos"/>
+                                  <w:b/>
+                                  <w:bCs/>
+                                </w:rPr>
+                                <w:t xml:space="preserve">post move </w:t>
+                              </w:r>
+                              <w:r>
+                                <w:rPr>
+                                  <w:rFonts w:eastAsia="Aptos"/>
+                                </w:rPr>
+                                <w:t xml:space="preserve">Nm, </w:t>
+                              </w:r>
+                              <w:proofErr w:type="spellStart"/>
+                              <w:r>
+                                <w:rPr>
+                                  <w:rFonts w:eastAsia="Aptos"/>
+                                </w:rPr>
+                                <w:t>Nf</w:t>
+                              </w:r>
+                              <w:proofErr w:type="spellEnd"/>
+                            </w:p>
+                          </w:txbxContent>
+                        </wps:txbx>
+                        <wps:bodyPr rot="0" spcFirstLastPara="0" vert="horz" wrap="square" lIns="91440" tIns="45720" rIns="91440" bIns="45720" numCol="1" spcCol="0" rtlCol="0" fromWordArt="0" anchor="ctr" anchorCtr="0" forceAA="0" compatLnSpc="1">
+                          <a:prstTxWarp prst="textNoShape">
+                            <a:avLst/>
+                          </a:prstTxWarp>
+                          <a:noAutofit/>
+                        </wps:bodyPr>
+                      </wps:wsp>
+                    </wpc:wpc>
+                  </a:graphicData>
+                </a:graphic>
+              </wp:inline>
+            </w:drawing>
+          </mc:Choice>
+          <mc:Fallback>
+            <w:pict>
+              <v:group w14:anchorId="1EF00198" id="Canvas 1" o:spid="_x0000_s1026" editas="canvas" style="width:6in;height:252pt;mso-position-horizontal-relative:char;mso-position-vertical-relative:line" coordsize="54864,32004" o:gfxdata="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">
+                <v:shapetype id="_x0000_t75" coordsize="21600,21600" o:spt="75" o:preferrelative="t" path="m@4@5l@4@11@9@11@9@5xe" filled="f" stroked="f">
+                  <v:stroke joinstyle="miter"/>
+                  <v:formulas>
+                    <v:f eqn="if lineDrawn pixelLineWidth 0"/>
+                    <v:f eqn="sum @0 1 0"/>
+                    <v:f eqn="sum 0 0 @1"/>
+                    <v:f eqn="prod @2 1 2"/>
+                    <v:f eqn="prod @3 21600 pixelWidth"/>
+                    <v:f eqn="prod @3 21600 pixelHeight"/>
+                    <v:f eqn="sum @0 0 1"/>
+                    <v:f eqn="prod @6 1 2"/>
+                    <v:f eqn="prod @7 21600 pixelWidth"/>
+                    <v:f eqn="sum @8 21600 0"/>
+                    <v:f eqn="prod @7 21600 pixelHeight"/>
+                    <v:f eqn="sum @10 21600 0"/>
+                  </v:formulas>
+                  <v:path o:extrusionok="f" gradientshapeok="t" o:connecttype="rect"/>
+                  <o:lock v:ext="edit" aspectratio="t"/>
+                </v:shapetype>
+                <v:shape id="_x0000_s1027" type="#_x0000_t75" style="position:absolute;width:54864;height:32004;visibility:visible;mso-wrap-style:square" filled="t">
+                  <v:fill o:detectmouseclick="t"/>
+                  <v:path o:connecttype="none"/>
+                </v:shape>
+                <v:shape id="Ink 92477461" o:spid="_x0000_s1028" type="#_x0000_t75" style="position:absolute;left:3635;top:12789;width:313;height:6415;visibility:visible;mso-wrap-style:square" o:gfxdata="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">
+                  <v:imagedata r:id="rId37" o:title=""/>
+                </v:shape>
+                <v:shape id="Ink 2077965448" o:spid="_x0000_s1029" type="#_x0000_t75" style="position:absolute;left:2061;top:6932;width:1685;height:3726;visibility:visible;mso-wrap-style:square" o:gfxdata="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">
+                  <v:imagedata r:id="rId38" o:title=""/>
+                </v:shape>
+                <v:shape id="Ink 779847745" o:spid="_x0000_s1030" type="#_x0000_t75" style="position:absolute;left:1824;top:8664;width:1011;height:151;visibility:visible;mso-wrap-style:square" o:gfxdata="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">
+                  <v:imagedata r:id="rId39" o:title=""/>
+                </v:shape>
+                <v:shape id="Ink 811176942" o:spid="_x0000_s1031" type="#_x0000_t75" style="position:absolute;left:4351;top:9985;width:1231;height:1688;visibility:visible;mso-wrap-style:square" o:gfxdata="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">
+                  <v:imagedata r:id="rId40" o:title=""/>
+                </v:shape>
+                <v:shape id="Ink 1344840202" o:spid="_x0000_s1032" type="#_x0000_t75" style="position:absolute;left:3861;top:16303;width:48755;height:547;visibility:visible;mso-wrap-style:square" o:gfxdata="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">
+                  <v:imagedata r:id="rId41" o:title=""/>
+                </v:shape>
+                <v:shape id="Ink 835747813" o:spid="_x0000_s1033" type="#_x0000_t75" style="position:absolute;left:52339;top:13768;width:691;height:5318;visibility:visible;mso-wrap-style:square" o:gfxdata="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">
+                  <v:imagedata r:id="rId42" o:title=""/>
+                </v:shape>
+                <v:shape id="Ink 104128317" o:spid="_x0000_s1034" type="#_x0000_t75" style="position:absolute;left:50456;top:8667;width:1599;height:2905;visibility:visible;mso-wrap-style:square" o:gfxdata="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">
+                  <v:imagedata r:id="rId43" o:title=""/>
+                </v:shape>
+                <v:shape id="Ink 1592978462" o:spid="_x0000_s1035" type="#_x0000_t75" style="position:absolute;left:49689;top:10014;width:1635;height:291;visibility:visible;mso-wrap-style:square" o:gfxdata="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">
+                  <v:imagedata r:id="rId44" o:title=""/>
+                </v:shape>
+                <v:shape id="Ink 101560594" o:spid="_x0000_s1036" type="#_x0000_t75" style="position:absolute;left:52339;top:11202;width:839;height:1155;visibility:visible;mso-wrap-style:square" o:gfxdata="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">
+                  <v:imagedata r:id="rId45" o:title=""/>
+                </v:shape>
+                <v:shape id="Ink 1320656223" o:spid="_x0000_s1037" type="#_x0000_t75" style="position:absolute;left:52533;top:12033;width:990;height:295;visibility:visible;mso-wrap-style:square" o:gfxdata="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">
+                  <v:imagedata r:id="rId46" o:title=""/>
+                </v:shape>
+                <v:shape id="Ink 770352982" o:spid="_x0000_s1038" type="#_x0000_t75" style="position:absolute;left:11623;top:14888;width:241;height:2898;visibility:visible;mso-wrap-style:square" o:gfxdata="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">
+                  <v:imagedata r:id="rId47" o:title=""/>
+                </v:shape>
+                <v:shape id="Ink 1267672213" o:spid="_x0000_s1039" type="#_x0000_t75" style="position:absolute;left:7969;top:19528;width:1195;height:1815;visibility:visible;mso-wrap-style:square" o:gfxdata="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">
+                  <v:imagedata r:id="rId48" o:title=""/>
+                </v:shape>
+                <v:shape id="Ink 943662521" o:spid="_x0000_s1040" type="#_x0000_t75" style="position:absolute;left:9449;top:20065;width:914;height:1663;visibility:visible;mso-wrap-style:square" o:gfxdata="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">
+                  <v:imagedata r:id="rId49" o:title=""/>
+                </v:shape>
+                <v:shape id="Ink 349513586" o:spid="_x0000_s1041" type="#_x0000_t75" style="position:absolute;left:10680;top:19878;width:698;height:1508;visibility:visible;mso-wrap-style:square" o:gfxdata="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">
+                  <v:imagedata r:id="rId50" o:title=""/>
+                </v:shape>
+                <v:shape id="Ink 109883749" o:spid="_x0000_s1042" type="#_x0000_t75" style="position:absolute;left:11540;top:19723;width:1030;height:1512;visibility:visible;mso-wrap-style:square" o:gfxdata="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">
+                  <v:imagedata r:id="rId51" o:title=""/>
+                </v:shape>
+                <v:shape id="Ink 1955052069" o:spid="_x0000_s1043" type="#_x0000_t75" style="position:absolute;left:17379;top:16015;width:274;height:1159;visibility:visible;mso-wrap-style:square" o:gfxdata="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">
+                  <v:imagedata r:id="rId52" o:title=""/>
+                </v:shape>
+                <v:shape id="Ink 260248086" o:spid="_x0000_s1044" type="#_x0000_t75" style="position:absolute;left:15093;top:18916;width:972;height:1916;visibility:visible;mso-wrap-style:square" o:gfxdata="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">
+                  <v:imagedata r:id="rId53" o:title=""/>
+                </v:shape>
+                <v:shape id="Ink 1633593794" o:spid="_x0000_s1045" type="#_x0000_t75" style="position:absolute;left:15907;top:19726;width:2153;height:1278;visibility:visible;mso-wrap-style:square" o:gfxdata="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">
+                  <v:imagedata r:id="rId54" o:title=""/>
+                </v:shape>
+                <v:shape id="Ink 1749567801" o:spid="_x0000_s1046" type="#_x0000_t75" style="position:absolute;left:18420;top:18855;width:1119;height:2099;visibility:visible;mso-wrap-style:square" o:gfxdata="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">
+                  <v:imagedata r:id="rId55" o:title=""/>
+                </v:shape>
+                <v:shape id="Ink 235111432" o:spid="_x0000_s1047" type="#_x0000_t75" style="position:absolute;left:19759;top:16861;width:31068;height:1440;visibility:visible;mso-wrap-style:square" o:gfxdata="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">
+                  <v:imagedata r:id="rId56" o:title=""/>
+                </v:shape>
+                <v:shape id="Ink 1702041107" o:spid="_x0000_s1048" type="#_x0000_t75" style="position:absolute;left:19899;top:16634;width:1534;height:2110;visibility:visible;mso-wrap-style:square" o:gfxdata="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">
+                  <v:imagedata r:id="rId57" o:title=""/>
+                </v:shape>
+                <v:shape id="Ink 322281722" o:spid="_x0000_s1049" type="#_x0000_t75" style="position:absolute;left:23975;top:19975;width:2116;height:1929;visibility:visible;mso-wrap-style:square" o:gfxdata="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">
+                  <v:imagedata r:id="rId58" o:title=""/>
+                </v:shape>
+                <v:shape id="Ink 1092419558" o:spid="_x0000_s1050" type="#_x0000_t75" style="position:absolute;left:26171;top:20504;width:2397;height:1494;visibility:visible;mso-wrap-style:square" o:gfxdata="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">
+                  <v:imagedata r:id="rId59" o:title=""/>
+                </v:shape>
+                <v:shape id="Ink 404477437" o:spid="_x0000_s1051" type="#_x0000_t75" style="position:absolute;left:28982;top:20806;width:1141;height:1239;visibility:visible;mso-wrap-style:square" o:gfxdata="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">
+                  <v:imagedata r:id="rId60" o:title=""/>
+                </v:shape>
+                <v:shape id="Ink 886082881" o:spid="_x0000_s1052" type="#_x0000_t75" style="position:absolute;left:30332;top:21408;width:331;height:903;visibility:visible;mso-wrap-style:square" o:gfxdata="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">
+                  <v:imagedata r:id="rId61" o:title=""/>
+                </v:shape>
+                <v:shape id="Ink 1576081196" o:spid="_x0000_s1053" type="#_x0000_t75" style="position:absolute;left:30530;top:20162;width:151;height:166;visibility:visible;mso-wrap-style:square" o:gfxdata="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">
+                  <v:imagedata r:id="rId62" o:title=""/>
+                </v:shape>
+                <v:shape id="Ink 1376182977" o:spid="_x0000_s1054" type="#_x0000_t75" style="position:absolute;left:30725;top:20904;width:2127;height:1432;visibility:visible;mso-wrap-style:square" o:gfxdata="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">
+                  <v:imagedata r:id="rId63" o:title=""/>
+                </v:shape>
+                <v:shape id="Ink 1699044281" o:spid="_x0000_s1055" type="#_x0000_t75" style="position:absolute;left:33561;top:20065;width:1340;height:2084;visibility:visible;mso-wrap-style:square" o:gfxdata="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">
+                  <v:imagedata r:id="rId64" o:title=""/>
+                </v:shape>
+                <v:shape id="Ink 154495301" o:spid="_x0000_s1056" type="#_x0000_t75" style="position:absolute;left:35131;top:20979;width:1469;height:943;visibility:visible;mso-wrap-style:square" o:gfxdata="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">
+                  <v:imagedata r:id="rId65" o:title=""/>
+                </v:shape>
+                <v:shape id="Ink 1942467071" o:spid="_x0000_s1057" type="#_x0000_t75" style="position:absolute;left:35372;top:21505;width:1595;height:2991;visibility:visible;mso-wrap-style:square" o:gfxdata="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">
+                  <v:imagedata r:id="rId66" o:title=""/>
+                </v:shape>
+                <v:shape id="Ink 1517664970" o:spid="_x0000_s1058" type="#_x0000_t75" style="position:absolute;left:37154;top:20742;width:907;height:1076;visibility:visible;mso-wrap-style:square" o:gfxdata="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">
+                  <v:imagedata r:id="rId67" o:title=""/>
+                </v:shape>
+                <v:shape id="Ink 510786032" o:spid="_x0000_s1059" type="#_x0000_t75" style="position:absolute;left:38036;top:21040;width:1390;height:944;visibility:visible;mso-wrap-style:square" o:gfxdata="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">
+                  <v:imagedata r:id="rId68" o:title=""/>
+                </v:shape>
+                <v:shape id="Ink 39819418" o:spid="_x0000_s1060" type="#_x0000_t75" style="position:absolute;left:39631;top:20320;width:2329;height:1635;visibility:visible;mso-wrap-style:square" o:gfxdata="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">
+                  <v:imagedata r:id="rId69" o:title=""/>
+                </v:shape>
+                <v:rect id="Rectangle 75118619" o:spid="_x0000_s1061" style="position:absolute;left:7365;top:1702;width:14140;height:6087;visibility:visible;mso-wrap-style:square;v-text-anchor:middle" o:gfxdata="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" filled="f" strokecolor="#4ea72e [3209]" strokeweight="1.5pt">
+                  <v:textbox>
+                    <w:txbxContent>
+                      <w:p>
+                        <w:pPr>
+                          <w:jc w:val="center"/>
+                        </w:pPr>
+                        <w:r>
+                          <w:t>Move = dens, sex ratio</w:t>
+                        </w:r>
+                      </w:p>
+                    </w:txbxContent>
+                  </v:textbox>
+                </v:rect>
+                <v:rect id="Rectangle 760750783" o:spid="_x0000_s1062" style="position:absolute;left:24848;top:1738;width:15703;height:6134;visibility:visible;mso-wrap-style:square;v-text-anchor:middle" o:gfxdata="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" filled="f" strokecolor="#4ea72e [3209]" strokeweight="1.5pt">
+                  <v:textbox>
+                    <w:txbxContent>
+                      <w:p>
+                        <w:pPr>
+                          <w:spacing w:line="276" w:lineRule="auto"/>
+                          <w:jc w:val="center"/>
+                          <w:rPr>
+                            <w:rFonts w:eastAsia="Aptos"/>
+                            <w14:ligatures w14:val="none"/>
+                          </w:rPr>
+                        </w:pPr>
+                        <w:proofErr w:type="gramStart"/>
+                        <w:r>
+                          <w:rPr>
+                            <w:rFonts w:eastAsia="Aptos"/>
+                          </w:rPr>
+                          <w:t>Breed  =</w:t>
+                        </w:r>
+                        <w:proofErr w:type="gramEnd"/>
+                        <w:r>
+                          <w:rPr>
+                            <w:rFonts w:eastAsia="Aptos"/>
+                          </w:rPr>
+                          <w:t xml:space="preserve"> </w:t>
+                        </w:r>
+                        <w:r>
+                          <w:rPr>
+                            <w:rFonts w:eastAsia="Aptos"/>
+                            <w:b/>
+                            <w:bCs/>
+                          </w:rPr>
+                          <w:t xml:space="preserve">post move </w:t>
+                        </w:r>
+                        <w:r>
+                          <w:rPr>
+                            <w:rFonts w:eastAsia="Aptos"/>
+                          </w:rPr>
+                          <w:t xml:space="preserve">Nm, </w:t>
+                        </w:r>
+                        <w:proofErr w:type="spellStart"/>
+                        <w:r>
+                          <w:rPr>
+                            <w:rFonts w:eastAsia="Aptos"/>
+                          </w:rPr>
+                          <w:t>Nf</w:t>
+                        </w:r>
+                        <w:proofErr w:type="spellEnd"/>
+                      </w:p>
+                    </w:txbxContent>
+                  </v:textbox>
+                </v:rect>
+                <w10:anchorlock/>
+              </v:group>
+            </w:pict>
+          </mc:Fallback>
+        </mc:AlternateContent>
+      </w:r>
+    </w:p>
     <w:p>
       <w:r>
         <w:t>Matrix diagonal = normal MPM rates</w:t>
@@ -46,72 +735,78 @@
     </w:p>
     <w:p>
       <w:r>
-        <w:t xml:space="preserve">Logit link function for </w:t>
-      </w:r>
-      <w:r>
-        <w:t>categorical response variable</w:t>
-      </w:r>
-      <w:r>
-        <w:t xml:space="preserve"> to continuous covariates</w:t>
-      </w:r>
-      <w:r>
-        <w:t xml:space="preserve">. </w:t>
-      </w:r>
-      <w:r>
-        <w:t>M</w:t>
-      </w:r>
-      <w:r>
-        <w:t xml:space="preserve">ovement categorical </w:t>
-      </w:r>
-      <w:r>
-        <w:t>(</w:t>
-      </w:r>
-      <w:r>
-        <w:t>binary</w:t>
-      </w:r>
-      <w:r>
-        <w:t>).</w:t>
-      </w:r>
-      <w:r>
-        <w:t xml:space="preserve"> Y is 0 or 1 (0 = stay, 1= move)</w:t>
-      </w:r>
-      <w:r>
-        <w:t xml:space="preserve">. </w:t>
-      </w:r>
+        <w:t xml:space="preserve">Defining movement function for </w:t>
+      </w:r>
+      <w:proofErr w:type="spellStart"/>
+      <w:r>
+        <w:t>Dmat</w:t>
+      </w:r>
+      <w:proofErr w:type="spellEnd"/>
     </w:p>
     <w:p>
       <w:r>
-        <w:t xml:space="preserve">P= prob(Y=1), </w:t>
-      </w:r>
-      <w:r>
-        <w:t xml:space="preserve">X= </w:t>
-      </w:r>
-      <w:r>
-        <w:t>distance, group size</w:t>
-      </w:r>
-      <w:r>
-        <w:t xml:space="preserve"> and sex ratio</w:t>
+        <w:t># base logistic equation = L / (1 - e^(-k(x-x0)))</w:t>
       </w:r>
     </w:p>
     <w:p>
       <w:r>
-        <w:t>Logit function forms linear relationship in P and X</w:t>
-      </w:r>
-      <w:r>
-        <w:t xml:space="preserve">. Fit model then back transform regression </w:t>
+        <w:t># L = 1 (max value, prob bound between 0 and 1)</w:t>
+      </w:r>
+    </w:p>
+    <w:p>
+      <w:r>
+        <w:t xml:space="preserve"># K = steepness of curve (vis using </w:t>
       </w:r>
       <w:proofErr w:type="spellStart"/>
       <w:r>
-        <w:t>coeff</w:t>
+        <w:t>desmos</w:t>
       </w:r>
       <w:proofErr w:type="spellEnd"/>
       <w:r>
-        <w:t xml:space="preserve"> for effect of X on Y. </w:t>
+        <w:t xml:space="preserve">). We want pop size as some density </w:t>
+      </w:r>
+      <w:proofErr w:type="spellStart"/>
+      <w:r>
+        <w:t>val</w:t>
+      </w:r>
+      <w:proofErr w:type="spellEnd"/>
+      <w:r>
+        <w:t>?</w:t>
+      </w:r>
+    </w:p>
+    <w:p>
+      <w:r>
+        <w:t># x0 = 0.5 (midpoint)</w:t>
+      </w:r>
+    </w:p>
+    <w:p>
+      <w:r>
+        <w:t xml:space="preserve">P= prob(Y=1), </w:t>
+      </w:r>
+      <w:r>
+        <w:t>X=</w:t>
+      </w:r>
+      <w:r>
+        <w:t xml:space="preserve"> group size</w:t>
+      </w:r>
+      <w:r>
+        <w:t xml:space="preserve"> and sex ratio</w:t>
+      </w:r>
+      <w:r>
+        <w:t xml:space="preserve"> OR number females?</w:t>
       </w:r>
     </w:p>
     <w:p/>
     <w:p>
-      <w:r>
+      <w:pPr>
+        <w:rPr>
+          <w:u w:val="single"/>
+        </w:rPr>
+      </w:pPr>
+      <w:r>
+        <w:rPr>
+          <w:u w:val="single"/>
+        </w:rPr>
         <w:t>Movement info</w:t>
       </w:r>
     </w:p>
@@ -173,6 +868,7 @@
         </w:rPr>
       </w:pPr>
       <w:r>
+        <w:lastRenderedPageBreak/>
         <w:t>Explanatory</w:t>
       </w:r>
       <w:r>
@@ -182,7 +878,7 @@
         <w:t>variables</w:t>
       </w:r>
       <w:r>
-        <w:t xml:space="preserve"> in logit link = </w:t>
+        <w:t xml:space="preserve"> = </w:t>
       </w:r>
       <w:r>
         <w:rPr>
@@ -295,7 +991,15 @@
         <w:t>Most important is distance</w:t>
       </w:r>
       <w:r>
-        <w:t xml:space="preserve">, others factors minimal </w:t>
+        <w:t xml:space="preserve">, others </w:t>
+      </w:r>
+      <w:proofErr w:type="gramStart"/>
+      <w:r>
+        <w:t>factors</w:t>
+      </w:r>
+      <w:proofErr w:type="gramEnd"/>
+      <w:r>
+        <w:t xml:space="preserve"> minimal </w:t>
       </w:r>
     </w:p>
     <w:p>
@@ -356,7 +1060,6 @@
     </w:p>
     <w:p>
       <w:r>
-        <w:lastRenderedPageBreak/>
         <w:t xml:space="preserve">Main loop </w:t>
       </w:r>
       <w:r>
@@ -497,6 +1200,11 @@
     <w:p>
       <w:r>
         <w:t xml:space="preserve">Why did we change from big mat projection to loops? Need help getting workflow moving. </w:t>
+      </w:r>
+    </w:p>
+    <w:p>
+      <w:r>
+        <w:t>Too complicated to fill reproduction in correct location, needed to calculate movement twice to workout reproduction in new group</w:t>
       </w:r>
     </w:p>
     <w:sectPr>
@@ -1452,6 +2160,897 @@
 </w:styles>
 </file>
 
+<file path=word/ink/ink1.xml><?xml version="1.0" encoding="utf-8"?>
+<inkml:ink xmlns:inkml="http://www.w3.org/2003/InkML">
+  <inkml:definitions>
+    <inkml:context xml:id="ctx0">
+      <inkml:inkSource xml:id="inkSrc0">
+        <inkml:traceFormat>
+          <inkml:channel name="X" type="integer" min="-2.14748E9" max="2.14748E9" units="cm"/>
+          <inkml:channel name="Y" type="integer" min="-2.14748E9" max="2.14748E9" units="cm"/>
+          <inkml:channel name="F" type="integer" max="32767" units="dev"/>
+        </inkml:traceFormat>
+        <inkml:channelProperties>
+          <inkml:channelProperty channel="X" name="resolution" value="1000" units="1/cm"/>
+          <inkml:channelProperty channel="Y" name="resolution" value="1000" units="1/cm"/>
+          <inkml:channelProperty channel="F" name="resolution" value="0" units="1/dev"/>
+        </inkml:channelProperties>
+      </inkml:inkSource>
+      <inkml:timestamp xml:id="ts0" timeString="2026-07-10T14:20:36.232"/>
+    </inkml:context>
+    <inkml:brush xml:id="br0">
+      <inkml:brushProperty name="width" value="0.035" units="cm"/>
+      <inkml:brushProperty name="height" value="0.035" units="cm"/>
+    </inkml:brush>
+  </inkml:definitions>
+  <inkml:trace contextRef="#ctx0" brushRef="#br0">36 1 24575,'1'26'0,"14"498"-33,-40 1 182,-2 120-1630,27-618-5345</inkml:trace>
+</inkml:ink>
+</file>
+
+<file path=word/ink/ink10.xml><?xml version="1.0" encoding="utf-8"?>
+<inkml:ink xmlns:inkml="http://www.w3.org/2003/InkML">
+  <inkml:definitions>
+    <inkml:context xml:id="ctx0">
+      <inkml:inkSource xml:id="inkSrc0">
+        <inkml:traceFormat>
+          <inkml:channel name="X" type="integer" min="-2.14748E9" max="2.14748E9" units="cm"/>
+          <inkml:channel name="Y" type="integer" min="-2.14748E9" max="2.14748E9" units="cm"/>
+          <inkml:channel name="F" type="integer" max="32767" units="dev"/>
+        </inkml:traceFormat>
+        <inkml:channelProperties>
+          <inkml:channelProperty channel="X" name="resolution" value="1000" units="1/cm"/>
+          <inkml:channelProperty channel="Y" name="resolution" value="1000" units="1/cm"/>
+          <inkml:channelProperty channel="F" name="resolution" value="0" units="1/dev"/>
+        </inkml:channelProperties>
+      </inkml:inkSource>
+      <inkml:timestamp xml:id="ts0" timeString="2026-07-10T14:20:46.315"/>
+    </inkml:context>
+    <inkml:brush xml:id="br0">
+      <inkml:brushProperty name="width" value="0.035" units="cm"/>
+      <inkml:brushProperty name="height" value="0.035" units="cm"/>
+    </inkml:brush>
+  </inkml:definitions>
+  <inkml:trace contextRef="#ctx0" brushRef="#br0">1 48 24575,'21'-1'0,"0"-2"0,0 0 0,0-1 0,22-8 0,33-7 0,-55 16-1365,-5 1-5461</inkml:trace>
+</inkml:ink>
+</file>
+
+<file path=word/ink/ink11.xml><?xml version="1.0" encoding="utf-8"?>
+<inkml:ink xmlns:inkml="http://www.w3.org/2003/InkML">
+  <inkml:definitions>
+    <inkml:context xml:id="ctx0">
+      <inkml:inkSource xml:id="inkSrc0">
+        <inkml:traceFormat>
+          <inkml:channel name="X" type="integer" min="-2.14748E9" max="2.14748E9" units="cm"/>
+          <inkml:channel name="Y" type="integer" min="-2.14748E9" max="2.14748E9" units="cm"/>
+          <inkml:channel name="F" type="integer" max="32767" units="dev"/>
+        </inkml:traceFormat>
+        <inkml:channelProperties>
+          <inkml:channelProperty channel="X" name="resolution" value="1000" units="1/cm"/>
+          <inkml:channelProperty channel="Y" name="resolution" value="1000" units="1/cm"/>
+          <inkml:channelProperty channel="F" name="resolution" value="0" units="1/dev"/>
+        </inkml:channelProperties>
+      </inkml:inkSource>
+      <inkml:timestamp xml:id="ts0" timeString="2026-07-10T14:20:56.122"/>
+    </inkml:context>
+    <inkml:brush xml:id="br0">
+      <inkml:brushProperty name="width" value="0.035" units="cm"/>
+      <inkml:brushProperty name="height" value="0.035" units="cm"/>
+    </inkml:brush>
+  </inkml:definitions>
+  <inkml:trace contextRef="#ctx0" brushRef="#br0">32 1 24575,'-1'3'0,"0"1"0,0-1 0,1 1 0,-1-1 0,1 0 0,0 1 0,0 4 0,0 4 0,-17 142-455,6 1 0,15 229 0,-1-351-6371</inkml:trace>
+</inkml:ink>
+</file>
+
+<file path=word/ink/ink12.xml><?xml version="1.0" encoding="utf-8"?>
+<inkml:ink xmlns:inkml="http://www.w3.org/2003/InkML">
+  <inkml:definitions>
+    <inkml:context xml:id="ctx0">
+      <inkml:inkSource xml:id="inkSrc0">
+        <inkml:traceFormat>
+          <inkml:channel name="X" type="integer" min="-2.14748E9" max="2.14748E9" units="cm"/>
+          <inkml:channel name="Y" type="integer" min="-2.14748E9" max="2.14748E9" units="cm"/>
+          <inkml:channel name="F" type="integer" max="32767" units="dev"/>
+        </inkml:traceFormat>
+        <inkml:channelProperties>
+          <inkml:channelProperty channel="X" name="resolution" value="1000" units="1/cm"/>
+          <inkml:channelProperty channel="Y" name="resolution" value="1000" units="1/cm"/>
+          <inkml:channelProperty channel="F" name="resolution" value="0" units="1/dev"/>
+        </inkml:channelProperties>
+      </inkml:inkSource>
+      <inkml:timestamp xml:id="ts0" timeString="2026-07-10T14:20:58.610"/>
+    </inkml:context>
+    <inkml:brush xml:id="br0">
+      <inkml:brushProperty name="width" value="0.035" units="cm"/>
+      <inkml:brushProperty name="height" value="0.035" units="cm"/>
+    </inkml:brush>
+  </inkml:definitions>
+  <inkml:trace contextRef="#ctx0" brushRef="#br0">25 312 24575,'-2'3'0,"1"-1"0,-1 0 0,1 1 0,0-1 0,0 1 0,0 0 0,0-1 0,0 1 0,1 0 0,-1 4 0,0-6 0,-2 20 0,0 0 0,1 0 0,2 40 0,-3-142 0,10-123 0,-4 179 0,10-43 0,-11 60 0,1-1 0,0 0 0,0 1 0,1 0 0,0 0 0,1 0 0,0 0 0,7-9 0,-12 17 0,0-1 0,1 1 0,-1-1 0,1 1 0,-1-1 0,1 1 0,-1-1 0,0 1 0,1-1 0,0 1 0,-1-1 0,1 1 0,-1 0 0,1-1 0,-1 1 0,1 0 0,0 0 0,-1 0 0,1-1 0,0 1 0,-1 0 0,1 0 0,0 0 0,-1 0 0,1 0 0,0 0 0,-1 0 0,1 0 0,0 0 0,-1 0 0,1 1 0,-1-1 0,1 0 0,0 0 0,-1 1 0,1-1 0,-1 0 0,1 1 0,0-1 0,-1 0 0,1 1 0,-1-1 0,1 1 0,-1-1 0,0 1 0,1-1 0,-1 1 0,1-1 0,-1 1 0,0-1 0,1 1 0,-1 0 0,0-1 0,0 1 0,0 0 0,1-1 0,-1 1 0,0 0 0,0 0 0,11 51 0,-10-44 0,6 35 0,-2-1 0,-1 1 0,-3 0 0,-4 43 0,5-95 0,0-1 0,1 1 0,0 0 0,6-11 0,4-14 0,4-39 0,-13 52 0,1 0 0,1 0 0,0 1 0,2 0 0,10-21 0,-18 40 0,1 0 0,-1 0 0,1 0 0,-1 0 0,1 0 0,-1 0 0,1 0 0,0 0 0,0 0 0,-1 1 0,1-1 0,0 0 0,0 0 0,0 1 0,0-1 0,0 0 0,0 1 0,0-1 0,0 1 0,0-1 0,0 1 0,0 0 0,1-1 0,0 1 0,-1 0 0,0 1 0,0-1 0,0 1 0,0 0 0,0-1 0,0 1 0,0 0 0,0-1 0,0 1 0,0 0 0,-1 0 0,1 0 0,0 0 0,-1 0 0,1 0 0,0 0 0,-1 0 0,1 0 0,-1 1 0,5 11 0,0 0 0,-2 0 0,3 15 0,-4-19 0,7 36-341,-3 1 0,-1 0-1,-2 67 1,-3-104-6485</inkml:trace>
+</inkml:ink>
+</file>
+
+<file path=word/ink/ink13.xml><?xml version="1.0" encoding="utf-8"?>
+<inkml:ink xmlns:inkml="http://www.w3.org/2003/InkML">
+  <inkml:definitions>
+    <inkml:context xml:id="ctx0">
+      <inkml:inkSource xml:id="inkSrc0">
+        <inkml:traceFormat>
+          <inkml:channel name="X" type="integer" min="-2.14748E9" max="2.14748E9" units="cm"/>
+          <inkml:channel name="Y" type="integer" min="-2.14748E9" max="2.14748E9" units="cm"/>
+          <inkml:channel name="F" type="integer" max="32767" units="dev"/>
+        </inkml:traceFormat>
+        <inkml:channelProperties>
+          <inkml:channelProperty channel="X" name="resolution" value="1000" units="1/cm"/>
+          <inkml:channelProperty channel="Y" name="resolution" value="1000" units="1/cm"/>
+          <inkml:channelProperty channel="F" name="resolution" value="0" units="1/dev"/>
+        </inkml:channelProperties>
+      </inkml:inkSource>
+      <inkml:timestamp xml:id="ts0" timeString="2026-07-10T14:20:59.293"/>
+    </inkml:context>
+    <inkml:brush xml:id="br0">
+      <inkml:brushProperty name="width" value="0.035" units="cm"/>
+      <inkml:brushProperty name="height" value="0.035" units="cm"/>
+    </inkml:brush>
+  </inkml:definitions>
+  <inkml:trace contextRef="#ctx0" brushRef="#br0">145 0 24575,'0'0'0,"0"0"0,0 0 0,-22 16 0,10-5 0,0 2 0,1 0 0,0 0 0,1 1 0,0 0 0,2 1 0,-1 0 0,2 0 0,-7 20 0,9-23 0,2 0 0,0 0 0,0 1 0,1-1 0,1 0 0,0 1 0,0 0 0,2-1 0,-1 1 0,2-1 0,-1 1 0,2-1 0,4 16 0,-6-24 0,1 0 0,0 0 0,0 0 0,0 1 0,1-2 0,-1 1 0,1 0 0,0 0 0,0-1 0,0 0 0,0 0 0,1 1 0,-1-2 0,7 5 0,-8-6 0,0 0 0,0 0 0,1 0 0,-1 0 0,0-1 0,1 1 0,-1-1 0,0 0 0,1 1 0,-1-1 0,1 0 0,-1-1 0,1 1 0,-1 0 0,0-1 0,1 1 0,-1-1 0,0 1 0,1-1 0,-1 0 0,0 0 0,0 0 0,0-1 0,0 1 0,0 0 0,0-1 0,0 1 0,3-4 0,4-5 0,0 0 0,-1-1 0,0 1 0,0-2 0,-1 1 0,-1-1 0,0 0 0,-1 0 0,0-1 0,7-25 0,-10 26 0,1 0 0,-1 0 0,-1-1 0,0 1 0,-1 0 0,-1-1 0,1 1 0,-2 0 0,0 0 0,0 0 0,-1 0 0,-6-14 0,9 24 5,0 1 1,-1 0-1,1-1 0,-1 1 0,0 0 0,1 0 1,-1-1-1,0 1 0,0 0 0,0 0 1,0 0-1,0 0 0,0 0 0,0 0 0,0 0 1,0 0-1,-1 0 0,1 1 0,0-1 0,0 0 1,-1 1-1,-1-1 0,2 1-70,-1 0 1,1 0-1,0 1 1,-1-1-1,1 1 1,0-1-1,-1 1 0,1-1 1,0 1-1,0-1 1,0 1-1,-1 0 1,1 0-1,0 0 0,0 0 1,0 0-1,0 0 1,0 0-1,1 0 1,-1 0-1,0 0 1,-1 2-1,-2 4-6761</inkml:trace>
+</inkml:ink>
+</file>
+
+<file path=word/ink/ink14.xml><?xml version="1.0" encoding="utf-8"?>
+<inkml:ink xmlns:inkml="http://www.w3.org/2003/InkML">
+  <inkml:definitions>
+    <inkml:context xml:id="ctx0">
+      <inkml:inkSource xml:id="inkSrc0">
+        <inkml:traceFormat>
+          <inkml:channel name="X" type="integer" min="-2.14748E9" max="2.14748E9" units="cm"/>
+          <inkml:channel name="Y" type="integer" min="-2.14748E9" max="2.14748E9" units="cm"/>
+          <inkml:channel name="F" type="integer" max="32767" units="dev"/>
+        </inkml:traceFormat>
+        <inkml:channelProperties>
+          <inkml:channelProperty channel="X" name="resolution" value="1000" units="1/cm"/>
+          <inkml:channelProperty channel="Y" name="resolution" value="1000" units="1/cm"/>
+          <inkml:channelProperty channel="F" name="resolution" value="0" units="1/dev"/>
+        </inkml:channelProperties>
+      </inkml:inkSource>
+      <inkml:timestamp xml:id="ts0" timeString="2026-07-10T14:20:59.838"/>
+    </inkml:context>
+    <inkml:brush xml:id="br0">
+      <inkml:brushProperty name="width" value="0.035" units="cm"/>
+      <inkml:brushProperty name="height" value="0.035" units="cm"/>
+    </inkml:brush>
+  </inkml:definitions>
+  <inkml:trace contextRef="#ctx0" brushRef="#br0">1 46 24575,'-1'26'0,"2"-18"0,-1 44 0,3-1 0,2 1 0,13 58 0,-16-97 0,4 12 0,-1-24 0,4-13 0,8-23 0,-2 0 0,18-63 0,8-79 0,-37 151-1365</inkml:trace>
+</inkml:ink>
+</file>
+
+<file path=word/ink/ink15.xml><?xml version="1.0" encoding="utf-8"?>
+<inkml:ink xmlns:inkml="http://www.w3.org/2003/InkML">
+  <inkml:definitions>
+    <inkml:context xml:id="ctx0">
+      <inkml:inkSource xml:id="inkSrc0">
+        <inkml:traceFormat>
+          <inkml:channel name="X" type="integer" min="-2.14748E9" max="2.14748E9" units="cm"/>
+          <inkml:channel name="Y" type="integer" min="-2.14748E9" max="2.14748E9" units="cm"/>
+          <inkml:channel name="F" type="integer" max="32767" units="dev"/>
+        </inkml:traceFormat>
+        <inkml:channelProperties>
+          <inkml:channelProperty channel="X" name="resolution" value="1000" units="1/cm"/>
+          <inkml:channelProperty channel="Y" name="resolution" value="1000" units="1/cm"/>
+          <inkml:channelProperty channel="F" name="resolution" value="0" units="1/dev"/>
+        </inkml:channelProperties>
+      </inkml:inkSource>
+      <inkml:timestamp xml:id="ts0" timeString="2026-07-10T14:21:00.395"/>
+    </inkml:context>
+    <inkml:brush xml:id="br0">
+      <inkml:brushProperty name="width" value="0.035" units="cm"/>
+      <inkml:brushProperty name="height" value="0.035" units="cm"/>
+    </inkml:brush>
+  </inkml:definitions>
+  <inkml:trace contextRef="#ctx0" brushRef="#br0">0 231 24575,'2'-2'0,"-1"-1"0,1 1 0,0 0 0,0-1 0,0 1 0,0 0 0,0 0 0,0 1 0,0-1 0,1 0 0,3-1 0,2-3 0,13-11 0,25-18 0,-3-2 0,63-67 0,-108 100 0,-8 3 0,-11 3 0,10 1 0,0 1 0,1 0 0,-1 1 0,1 0 0,0 1 0,0 0 0,1 0 0,0 1 0,0 1 0,0-1 0,1 2 0,0-1 0,-11 16 0,13-16 0,0 1 0,0 0 0,1-1 0,1 2 0,-1-1 0,2 0 0,-1 1 0,1 0 0,0 0 0,1 0 0,1 0 0,-1 0 0,2 0 0,-1 1 0,2 15 0,1-19-68,0-1 0,0 0-1,0 0 1,1 0 0,0-1 0,0 1-1,1-1 1,-1 1 0,1-1 0,0 0-1,1-1 1,-1 1 0,1-1 0,0 1-1,0-2 1,0 1 0,1 0 0,-1-1-1,12 5 1,1 0-6758</inkml:trace>
+</inkml:ink>
+</file>
+
+<file path=word/ink/ink16.xml><?xml version="1.0" encoding="utf-8"?>
+<inkml:ink xmlns:inkml="http://www.w3.org/2003/InkML">
+  <inkml:definitions>
+    <inkml:context xml:id="ctx0">
+      <inkml:inkSource xml:id="inkSrc0">
+        <inkml:traceFormat>
+          <inkml:channel name="X" type="integer" min="-2.14748E9" max="2.14748E9" units="cm"/>
+          <inkml:channel name="Y" type="integer" min="-2.14748E9" max="2.14748E9" units="cm"/>
+          <inkml:channel name="F" type="integer" max="32767" units="dev"/>
+        </inkml:traceFormat>
+        <inkml:channelProperties>
+          <inkml:channelProperty channel="X" name="resolution" value="1000" units="1/cm"/>
+          <inkml:channelProperty channel="Y" name="resolution" value="1000" units="1/cm"/>
+          <inkml:channelProperty channel="F" name="resolution" value="0" units="1/dev"/>
+        </inkml:channelProperties>
+      </inkml:inkSource>
+      <inkml:timestamp xml:id="ts0" timeString="2026-07-10T14:21:01.927"/>
+    </inkml:context>
+    <inkml:brush xml:id="br0">
+      <inkml:brushProperty name="width" value="0.035" units="cm"/>
+      <inkml:brushProperty name="height" value="0.035" units="cm"/>
+    </inkml:brush>
+  </inkml:definitions>
+  <inkml:trace contextRef="#ctx0" brushRef="#br0">41 0 24575,'-1'1'0,"0"1"0,0-1 0,-1 0 0,1 1 0,0-1 0,0 1 0,0-1 0,1 1 0,-1-1 0,0 1 0,1 0 0,-1-1 0,1 1 0,-1 0 0,1 2 0,-9 41-182,2 1 0,-1 65 0,6-83-637,0 2-6007</inkml:trace>
+</inkml:ink>
+</file>
+
+<file path=word/ink/ink17.xml><?xml version="1.0" encoding="utf-8"?>
+<inkml:ink xmlns:inkml="http://www.w3.org/2003/InkML">
+  <inkml:definitions>
+    <inkml:context xml:id="ctx0">
+      <inkml:inkSource xml:id="inkSrc0">
+        <inkml:traceFormat>
+          <inkml:channel name="X" type="integer" min="-2.14748E9" max="2.14748E9" units="cm"/>
+          <inkml:channel name="Y" type="integer" min="-2.14748E9" max="2.14748E9" units="cm"/>
+          <inkml:channel name="F" type="integer" max="32767" units="dev"/>
+        </inkml:traceFormat>
+        <inkml:channelProperties>
+          <inkml:channelProperty channel="X" name="resolution" value="1000" units="1/cm"/>
+          <inkml:channelProperty channel="Y" name="resolution" value="1000" units="1/cm"/>
+          <inkml:channelProperty channel="F" name="resolution" value="0" units="1/dev"/>
+        </inkml:channelProperties>
+      </inkml:inkSource>
+      <inkml:timestamp xml:id="ts0" timeString="2026-07-10T14:21:03.310"/>
+    </inkml:context>
+    <inkml:brush xml:id="br0">
+      <inkml:brushProperty name="width" value="0.035" units="cm"/>
+      <inkml:brushProperty name="height" value="0.035" units="cm"/>
+    </inkml:brush>
+  </inkml:definitions>
+  <inkml:trace contextRef="#ctx0" brushRef="#br0">104 1 24575,'-2'1'0,"1"1"0,-1 0 0,1 0 0,0-1 0,0 1 0,0 0 0,0 0 0,0 0 0,0 0 0,0 0 0,1 1 0,-1-1 0,0 3 0,-29 168 0,4-21 0,13-105 0,8-32 0,1 1 0,0-1 0,1 1 0,-1 16 0,6-43 0,-1 0 0,2 1 0,-1-1 0,9-19 0,1-6 0,-4 5 0,1 1 0,1 1 0,17-33 0,-23 54 0,0 0 0,1 0 0,0 1 0,0-1 0,1 1 0,0 0 0,0 1 0,1 0 0,0 0 0,0 0 0,0 0 0,1 1 0,0 1 0,0-1 0,13-4 0,-20 8 0,0 1 0,-1 0 0,1-1 0,0 1 0,0 0 0,0 0 0,0 0 0,0 0 0,0-1 0,0 2 0,0-1 0,0 0 0,0 0 0,-1 0 0,1 0 0,0 0 0,0 1 0,0-1 0,0 0 0,0 1 0,-1-1 0,1 1 0,0-1 0,0 1 0,0-1 0,-1 1 0,2 0 0,-1 1 0,0 0 0,0 0 0,0 0 0,0 0 0,0 0 0,0 1 0,0-1 0,0 0 0,-1 0 0,1 5 0,0 2 0,-1 1 0,0 0 0,0-1 0,-2 13 0,-2-6 14,0 0-1,0 0 0,-2-1 0,0 0 1,-1 0-1,0 0 0,-1-1 1,-19 26-1,21-31-119,-2 0 0,1-1 0,-1 0 0,0 0 0,-1 0 0,0-1-1,0-1 1,-1 1 0,0-1 0,0-1 0,0 0 0,0 0 0,-19 4 0,18-7-6720</inkml:trace>
+</inkml:ink>
+</file>
+
+<file path=word/ink/ink18.xml><?xml version="1.0" encoding="utf-8"?>
+<inkml:ink xmlns:inkml="http://www.w3.org/2003/InkML">
+  <inkml:definitions>
+    <inkml:context xml:id="ctx0">
+      <inkml:inkSource xml:id="inkSrc0">
+        <inkml:traceFormat>
+          <inkml:channel name="X" type="integer" min="-2.14748E9" max="2.14748E9" units="cm"/>
+          <inkml:channel name="Y" type="integer" min="-2.14748E9" max="2.14748E9" units="cm"/>
+          <inkml:channel name="F" type="integer" max="32767" units="dev"/>
+        </inkml:traceFormat>
+        <inkml:channelProperties>
+          <inkml:channelProperty channel="X" name="resolution" value="1000" units="1/cm"/>
+          <inkml:channelProperty channel="Y" name="resolution" value="1000" units="1/cm"/>
+          <inkml:channelProperty channel="F" name="resolution" value="0" units="1/dev"/>
+        </inkml:channelProperties>
+      </inkml:inkSource>
+      <inkml:timestamp xml:id="ts0" timeString="2026-07-10T14:21:04.786"/>
+    </inkml:context>
+    <inkml:brush xml:id="br0">
+      <inkml:brushProperty name="width" value="0.035" units="cm"/>
+      <inkml:brushProperty name="height" value="0.035" units="cm"/>
+    </inkml:brush>
+  </inkml:definitions>
+  <inkml:trace contextRef="#ctx0" brushRef="#br0">0 60 24575,'0'0'0,"0"0"0,1 14 0,1 0 0,0 0 0,1 0 0,6 19 0,-4-17 0,-1 0 0,4 28 0,-8 33 0,18-133 0,-5 1 0,-10 35 0,2 0 0,0 0 0,1 1 0,14-31 0,-16 52 0,0 1 0,-1-1 0,1 1 0,-1-1 0,0 1 0,0 0 0,4 4 0,20 18 0,-24-23 0,1 0 0,-1 0 0,0 0 0,0 0 0,1-1 0,0 1 0,-1-1 0,1 0 0,-1 0 0,1 0 0,0-1 0,0 1 0,-1-1 0,1 0 0,0 0 0,0 0 0,0-1 0,-1 1 0,6-2 0,-1-1 0,-1 0 0,0-1 0,0 0 0,0 0 0,0 0 0,0-1 0,-1 0 0,7-7 0,4-8 0,-15 12 0,-15 6 0,11 4 0,-1-1 0,0 0 0,1 0 0,-1 1 0,1 0 0,0-1 0,-1 1 0,1 0 0,0 0 0,0 0 0,0 1 0,0-1 0,1 0 0,-1 1 0,1-1 0,-1 1 0,0 2 0,-19 48 0,18-42 0,1 0 0,0 0 0,1 0 0,0 0 0,1 1 0,2 16 0,-2-24 0,0 0 0,1 0 0,-1 0 0,1 0 0,0-1 0,0 1 0,1 0 0,-1 0 0,1-1 0,0 1 0,-1 0 0,2-1 0,-1 0 0,0 1 0,1-1 0,-1 0 0,1-1 0,0 1 0,0 0 0,0-1 0,5 4 0,-4-5 0,0 0 0,0-1 0,0 1 0,0-1 0,0 0 0,0 1 0,0-2 0,0 1 0,0-1 0,0 1 0,0-1 0,0 0 0,0 0 0,0-1 0,0 1 0,-1-1 0,1 0 0,0 0 0,4-4 0,7-4 0,0 0 0,25-25 0,-24 20 0,-2-1 0,0 0 0,20-29 0,-29 38 0,-1-1 0,0 0 0,0 0 0,0 0 0,-1 0 0,0 0 0,-1-1 0,0 1 0,0-1 0,-1 0 0,1-14 0,-2 21 0,0 1 0,0-1 0,0 1 0,0-1 0,0 1 0,0-1 0,0 1 0,-1-1 0,1 1 0,-1-1 0,1 1 0,-1-1 0,0 1 0,1 0 0,-1-1 0,0 1 0,0 0 0,0 0 0,0-1 0,0 1 0,0 0 0,0 0 0,0 0 0,0 0 0,-1 0 0,1 1 0,0-1 0,-1 0 0,1 1 0,0-1 0,-1 0 0,1 1 0,-1 0 0,1-1 0,-1 1 0,1 0 0,-3 0 0,1 0 0,0 0 0,0 1 0,0 0 0,1-1 0,-1 1 0,0 0 0,0 0 0,1 0 0,-1 1 0,1-1 0,-1 1 0,1 0 0,0-1 0,0 1 0,-1 0 0,1 0 0,0 0 0,1 1 0,-3 2 0,1-1 0,0 1 0,0-1 0,1 1 0,0 0 0,0 0 0,0 0 0,0 0 0,1 0 0,0 1 0,0-1 0,0 0 0,1 1 0,0-1 0,0 0 0,0 1 0,1-1 0,-1 1 0,1-1 0,3 9 0,-1-8 0,0 0 0,0 0 0,0-1 0,0 1 0,1-1 0,0 0 0,0 0 0,1 0 0,0 0 0,-1-1 0,1 0 0,1 0 0,-1 0 0,1-1 0,9 6 0,1-2-1365,-3-2-5461</inkml:trace>
+</inkml:ink>
+</file>
+
+<file path=word/ink/ink19.xml><?xml version="1.0" encoding="utf-8"?>
+<inkml:ink xmlns:inkml="http://www.w3.org/2003/InkML">
+  <inkml:definitions>
+    <inkml:context xml:id="ctx0">
+      <inkml:inkSource xml:id="inkSrc0">
+        <inkml:traceFormat>
+          <inkml:channel name="X" type="integer" min="-2.14748E9" max="2.14748E9" units="cm"/>
+          <inkml:channel name="Y" type="integer" min="-2.14748E9" max="2.14748E9" units="cm"/>
+          <inkml:channel name="F" type="integer" max="32767" units="dev"/>
+        </inkml:traceFormat>
+        <inkml:channelProperties>
+          <inkml:channelProperty channel="X" name="resolution" value="1000" units="1/cm"/>
+          <inkml:channelProperty channel="Y" name="resolution" value="1000" units="1/cm"/>
+          <inkml:channelProperty channel="F" name="resolution" value="0" units="1/dev"/>
+        </inkml:channelProperties>
+      </inkml:inkSource>
+      <inkml:timestamp xml:id="ts0" timeString="2026-07-10T14:21:05.673"/>
+    </inkml:context>
+    <inkml:brush xml:id="br0">
+      <inkml:brushProperty name="width" value="0.035" units="cm"/>
+      <inkml:brushProperty name="height" value="0.035" units="cm"/>
+    </inkml:brush>
+  </inkml:definitions>
+  <inkml:trace contextRef="#ctx0" brushRef="#br0">243 336 24575,'0'0'0,"0"0"0,0 0 0,-2-1 0,0-1 0,0 0 0,0 1 0,0-1 0,0 1 0,0-1 0,0 1 0,0 0 0,0 0 0,0 0 0,-1 0 0,1 1 0,-3-2 0,-2 1 0,0-1 0,0 1 0,-1 0 0,1 0 0,0 1 0,0 0 0,-1 1 0,1-1 0,0 1 0,0 1 0,0-1 0,0 1 0,0 1 0,0-1 0,0 1 0,0 0 0,1 1 0,-6 3 0,6-3 0,1 0 0,0 0 0,0 0 0,0 0 0,1 1 0,-1-1 0,1 1 0,0 0 0,1 1 0,-1-1 0,1 1 0,0 0 0,0-1 0,1 1 0,0 0 0,0 1 0,0-1 0,1 0 0,0 0 0,-1 12 0,2-17 0,0 0 0,0 0 0,0 0 0,0 0 0,0 0 0,0-1 0,0 1 0,0 0 0,1 0 0,-1 0 0,0 0 0,0-1 0,1 1 0,-1 0 0,1 0 0,-1-1 0,1 1 0,-1 0 0,1 0 0,-1-1 0,1 1 0,-1-1 0,1 1 0,0-1 0,-1 1 0,1-1 0,0 1 0,0-1 0,-1 1 0,1-1 0,0 0 0,0 1 0,0-1 0,0 0 0,-1 0 0,1 0 0,0 0 0,0 0 0,0 0 0,0 0 0,0 0 0,-1 0 0,1 0 0,0 0 0,0 0 0,0-1 0,0 1 0,-1 0 0,2-1 0,2 0 0,1-1 0,-1 0 0,0 0 0,1 0 0,-1 0 0,0-1 0,6-5 0,6-9 0,-1 0 0,0-1 0,-1 0 0,-1-2 0,-1 1 0,-1-2 0,15-37 0,42-159 0,-58 180 0,-4 17 0,-9 40 0,-1-2 0,-14 69-115,-17 115 359,31-173-543,2 0 0,2 0 1,0 1-1,9 54 0,-5-64-6527</inkml:trace>
+</inkml:ink>
+</file>
+
+<file path=word/ink/ink2.xml><?xml version="1.0" encoding="utf-8"?>
+<inkml:ink xmlns:inkml="http://www.w3.org/2003/InkML">
+  <inkml:definitions>
+    <inkml:context xml:id="ctx0">
+      <inkml:inkSource xml:id="inkSrc0">
+        <inkml:traceFormat>
+          <inkml:channel name="X" type="integer" min="-2.14748E9" max="2.14748E9" units="cm"/>
+          <inkml:channel name="Y" type="integer" min="-2.14748E9" max="2.14748E9" units="cm"/>
+          <inkml:channel name="F" type="integer" max="32767" units="dev"/>
+        </inkml:traceFormat>
+        <inkml:channelProperties>
+          <inkml:channelProperty channel="X" name="resolution" value="1000" units="1/cm"/>
+          <inkml:channelProperty channel="Y" name="resolution" value="1000" units="1/cm"/>
+          <inkml:channelProperty channel="F" name="resolution" value="0" units="1/dev"/>
+        </inkml:channelProperties>
+      </inkml:inkSource>
+      <inkml:timestamp xml:id="ts0" timeString="2026-07-10T14:20:38.116"/>
+    </inkml:context>
+    <inkml:brush xml:id="br0">
+      <inkml:brushProperty name="width" value="0.035" units="cm"/>
+      <inkml:brushProperty name="height" value="0.035" units="cm"/>
+    </inkml:brush>
+  </inkml:definitions>
+  <inkml:trace contextRef="#ctx0" brushRef="#br0">200 0 24575,'0'0'0,"-1"20"0,-14 57 0,-2 0 0,-36 93 0,-6 20 0,44-135-282,2 1-1,3 1 0,-7 103 1,17-154-85,0-1 1,1 1 0,-1-1 0,1 1-1,0-1 1,0 0 0,1 1 0,0-1 0,0 0-1,0 0 1,0 0 0,1 0 0,0 0-1,0-1 1,0 1 0,6 6 0,-4-7 486,0 0 1,1 1-1,0-2 0,0 1 1,0-1-1,0 0 1,0 0-1,1 0 0,-1-1 1,1 0-1,11 2 1,2-2 618,0-1 0,1 0 0,-1-1-1,1-1 1,-1-1 0,0-1 0,35-10 0,44-20-2104,-81 26-5461</inkml:trace>
+</inkml:ink>
+</file>
+
+<file path=word/ink/ink20.xml><?xml version="1.0" encoding="utf-8"?>
+<inkml:ink xmlns:inkml="http://www.w3.org/2003/InkML">
+  <inkml:definitions>
+    <inkml:context xml:id="ctx0">
+      <inkml:inkSource xml:id="inkSrc0">
+        <inkml:traceFormat>
+          <inkml:channel name="X" type="integer" min="-2.14748E9" max="2.14748E9" units="cm"/>
+          <inkml:channel name="Y" type="integer" min="-2.14748E9" max="2.14748E9" units="cm"/>
+          <inkml:channel name="F" type="integer" max="32767" units="dev"/>
+        </inkml:traceFormat>
+        <inkml:channelProperties>
+          <inkml:channelProperty channel="X" name="resolution" value="1000" units="1/cm"/>
+          <inkml:channelProperty channel="Y" name="resolution" value="1000" units="1/cm"/>
+          <inkml:channelProperty channel="F" name="resolution" value="0" units="1/dev"/>
+        </inkml:channelProperties>
+      </inkml:inkSource>
+      <inkml:timestamp xml:id="ts0" timeString="2026-07-10T14:21:13.360"/>
+    </inkml:context>
+    <inkml:brush xml:id="br0">
+      <inkml:brushProperty name="width" value="0.035" units="cm"/>
+      <inkml:brushProperty name="height" value="0.035" units="cm"/>
+    </inkml:brush>
+  </inkml:definitions>
+  <inkml:trace contextRef="#ctx0" brushRef="#br0">0 233 24575,'4'-1'0,"0"0"0,0 0 0,1 1 0,-1 0 0,0 0 0,0 0 0,7 1 0,5 1 0,103 3 0,142 25 0,45 4 0,1724 5 0,-1116-22 0,-594-9 0,483-51 0,-666 30 0,182-10 0,29-3 0,723-30 0,-390 64 0,-337-16 0,-134 2 0,-9-8 0,39 0 0,-5 15 0,-245-22 0,-12-1 0,-1 2 0,-1 0 0,-1 2 0,-1 1 0,-45-23 0,65 37 0,4 2 0,0-1 0,-1 1 0,1 0 0,-1 0 0,1 0 0,-1 0 0,1 0 0,-1 1 0,-3-1 0,10 3 0,-1 0 0,0 1 0,0-1 0,-1 1 0,1-1 0,0 1 0,2 4 0,2 1 0,108 85 0,-115-91 0,1-1 0,0 0 0,0 0 0,-1 0 0,1 0 0,0 1 0,-1-1 0,0 0 0,1 0 0,-1 1 0,0-1 0,1 0 0,-1 1 0,0-1 0,0 0 0,0 1 0,0-1 0,0 1 0,0-1 0,-1 0 0,1 1 0,0-1 0,-1 0 0,1 0 0,-1 1 0,1-1 0,-1 0 0,0 0 0,1 0 0,-1 1 0,0-1 0,0 0 0,0 0 0,-1 1 0,-5 6 0,-1 0 0,0 0 0,-10 7 0,9-8 0,-42 34-23,36-32-169,1 2 1,1 0-1,0 0 0,1 1 0,0 1 1,-11 15-1,19-21-6634</inkml:trace>
+</inkml:ink>
+</file>
+
+<file path=word/ink/ink21.xml><?xml version="1.0" encoding="utf-8"?>
+<inkml:ink xmlns:inkml="http://www.w3.org/2003/InkML">
+  <inkml:definitions>
+    <inkml:context xml:id="ctx0">
+      <inkml:inkSource xml:id="inkSrc0">
+        <inkml:traceFormat>
+          <inkml:channel name="X" type="integer" min="-2.14748E9" max="2.14748E9" units="cm"/>
+          <inkml:channel name="Y" type="integer" min="-2.14748E9" max="2.14748E9" units="cm"/>
+          <inkml:channel name="F" type="integer" max="32767" units="dev"/>
+        </inkml:traceFormat>
+        <inkml:channelProperties>
+          <inkml:channelProperty channel="X" name="resolution" value="1000" units="1/cm"/>
+          <inkml:channelProperty channel="Y" name="resolution" value="1000" units="1/cm"/>
+          <inkml:channelProperty channel="F" name="resolution" value="0" units="1/dev"/>
+        </inkml:channelProperties>
+      </inkml:inkSource>
+      <inkml:timestamp xml:id="ts0" timeString="2026-07-10T14:21:14.741"/>
+    </inkml:context>
+    <inkml:brush xml:id="br0">
+      <inkml:brushProperty name="width" value="0.035" units="cm"/>
+      <inkml:brushProperty name="height" value="0.035" units="cm"/>
+    </inkml:brush>
+  </inkml:definitions>
+  <inkml:trace contextRef="#ctx0" brushRef="#br0">63 438 24575,'4'-28'0,"3"9"0,1 1 0,1 0 0,0 0 0,1 0 0,1 2 0,16-20 0,87-90 0,-49 57 0,-1-2 0,-106 90 0,-163 119 0,160-106 0,21-17 0,15-9 0,0-1 0,0 1 0,1 1 0,-1 0 0,1 0 0,-11 14 0,18-20 0,1 0 0,-1 0 0,1 0 0,0 0 0,-1 0 0,1 0 0,0 0 0,-1 0 0,1 0 0,0 1 0,0-1 0,0 0 0,0 0 0,0 0 0,0 0 0,1 0 0,-1 1 0,0-1 0,1 0 0,-1 0 0,0 0 0,1 0 0,-1 0 0,1 0 0,0 0 0,-1 0 0,1 0 0,0 0 0,1 1 0,29 25 0,-21-19 0,219 192-1365,-207-181-5461</inkml:trace>
+</inkml:ink>
+</file>
+
+<file path=word/ink/ink22.xml><?xml version="1.0" encoding="utf-8"?>
+<inkml:ink xmlns:inkml="http://www.w3.org/2003/InkML">
+  <inkml:definitions>
+    <inkml:context xml:id="ctx0">
+      <inkml:inkSource xml:id="inkSrc0">
+        <inkml:traceFormat>
+          <inkml:channel name="X" type="integer" min="-2.14748E9" max="2.14748E9" units="cm"/>
+          <inkml:channel name="Y" type="integer" min="-2.14748E9" max="2.14748E9" units="cm"/>
+          <inkml:channel name="F" type="integer" max="32767" units="dev"/>
+        </inkml:traceFormat>
+        <inkml:channelProperties>
+          <inkml:channelProperty channel="X" name="resolution" value="1000" units="1/cm"/>
+          <inkml:channelProperty channel="Y" name="resolution" value="1000" units="1/cm"/>
+          <inkml:channelProperty channel="F" name="resolution" value="0" units="1/dev"/>
+        </inkml:channelProperties>
+      </inkml:inkSource>
+      <inkml:timestamp xml:id="ts0" timeString="2026-07-10T14:21:16.204"/>
+    </inkml:context>
+    <inkml:brush xml:id="br0">
+      <inkml:brushProperty name="width" value="0.035" units="cm"/>
+      <inkml:brushProperty name="height" value="0.035" units="cm"/>
+    </inkml:brush>
+  </inkml:definitions>
+  <inkml:trace contextRef="#ctx0" brushRef="#br0">553 5 24575,'-74'-2'0,"38"0"0,-60 5 0,65 0 0,1 2 0,-38 10 0,60-12 0,0-1 0,0 1 0,0 0 0,0 1 0,0 0 0,1 0 0,-1 1 0,1 0 0,1 0 0,-1 1 0,1 0 0,-12 13 0,17-18 0,1 1 0,-1-1 0,0 1 0,1-1 0,-1 1 0,1-1 0,-1 1 0,1 0 0,0-1 0,0 1 0,0-1 0,0 1 0,0 0 0,0-1 0,0 1 0,0-1 0,0 1 0,1 0 0,-1-1 0,1 1 0,-1-1 0,1 1 0,0-1 0,0 0 0,0 1 0,-1-1 0,1 0 0,0 1 0,1-1 0,-1 0 0,0 0 0,0 0 0,0 0 0,2 1 0,8 6 0,-1 0 0,1-1 0,16 8 0,-11-6 0,-7-3 0,0 0 0,0 0 0,-1 1 0,0 0 0,0 0 0,0 1 0,-1 0 0,0 0 0,-1 1 0,0 0 0,9 18 0,-12-21 0,-1 0 0,0 0 0,-1 0 0,1 0 0,-1 1 0,0-1 0,-1 0 0,0 0 0,0 1 0,0-1 0,-1 0 0,1 1 0,-2-1 0,1 0 0,-1 0 0,0 0 0,0 0 0,0 0 0,-1-1 0,0 1 0,-7 9 0,8-10 0,-1-1 0,-1 0 0,1 0 0,-1 0 0,1-1 0,-1 1 0,0-1 0,0 0 0,-1 0 0,1 0 0,0 0 0,-1-1 0,0 0 0,0 0 0,0 0 0,0 0 0,0-1 0,0 0 0,0 0 0,0-1 0,-9 1 0,7-1 0,0-1 0,0 0 0,0-1 0,0 1 0,0-1 0,1-1 0,-1 1 0,1-1 0,0 0 0,0-1 0,0 1 0,0-1 0,0 0 0,1-1 0,-8-7 0,4 3-170,0-1-1,1 0 0,1-1 1,0 1-1,0-1 0,1-1 1,-6-15-1,7 14-6655</inkml:trace>
+</inkml:ink>
+</file>
+
+<file path=word/ink/ink23.xml><?xml version="1.0" encoding="utf-8"?>
+<inkml:ink xmlns:inkml="http://www.w3.org/2003/InkML">
+  <inkml:definitions>
+    <inkml:context xml:id="ctx0">
+      <inkml:inkSource xml:id="inkSrc0">
+        <inkml:traceFormat>
+          <inkml:channel name="X" type="integer" min="-2.14748E9" max="2.14748E9" units="cm"/>
+          <inkml:channel name="Y" type="integer" min="-2.14748E9" max="2.14748E9" units="cm"/>
+          <inkml:channel name="F" type="integer" max="32767" units="dev"/>
+        </inkml:traceFormat>
+        <inkml:channelProperties>
+          <inkml:channelProperty channel="X" name="resolution" value="1000" units="1/cm"/>
+          <inkml:channelProperty channel="Y" name="resolution" value="1000" units="1/cm"/>
+          <inkml:channelProperty channel="F" name="resolution" value="0" units="1/dev"/>
+        </inkml:channelProperties>
+      </inkml:inkSource>
+      <inkml:timestamp xml:id="ts0" timeString="2026-07-10T14:21:17.467"/>
+    </inkml:context>
+    <inkml:brush xml:id="br0">
+      <inkml:brushProperty name="width" value="0.035" units="cm"/>
+      <inkml:brushProperty name="height" value="0.035" units="cm"/>
+    </inkml:brush>
+  </inkml:definitions>
+  <inkml:trace contextRef="#ctx0" brushRef="#br0">80 1 24575,'0'0'0,"0"0"0,-15 19 0,1 8 0,-21 56 0,31-73 0,1 0 0,1 0 0,0 0 0,0 1 0,1-1 0,0 0 0,1 1 0,0-1 0,2 17 0,-2-24 0,1 0 0,-1 0 0,1-1 0,0 1 0,0 0 0,0 0 0,0-1 0,0 1 0,1 0 0,-1-1 0,1 1 0,0-1 0,0 0 0,0 1 0,0-1 0,0 0 0,0 0 0,0 0 0,1-1 0,-1 1 0,1-1 0,-1 1 0,1-1 0,0 0 0,-1 0 0,1 0 0,0 0 0,0 0 0,0-1 0,0 1 0,0-1 0,0 0 0,0 0 0,-1 0 0,1 0 0,0 0 0,4-1 0,3-1 0,0-1 0,0 0 0,0 0 0,-1-1 0,1 0 0,-1-1 0,0 0 0,0 0 0,10-8 0,0-4 0,0-1 0,-1-1 0,-1 0 0,18-28 0,-6 10 0,-38 51 0,1 0 0,0 1 0,1 0 0,-5 17 0,7-20 0,1 1 0,0 0 0,1 0 0,0 1 0,2-1 0,-2 24 0,3-34 0,0 0 0,1 0 0,-1 0 0,1 0 0,-1 0 0,1 0 0,0 0 0,0 0 0,0 0 0,1 0 0,-1 0 0,1-1 0,-1 1 0,1-1 0,0 1 0,0-1 0,0 0 0,0 1 0,1-1 0,2 2 0,-1-2 0,0 0 0,0-1 0,0 1 0,-1-1 0,1 0 0,0 0 0,1-1 0,-1 1 0,0-1 0,0 0 0,0 0 0,0 0 0,6-1 0,2-1 0,-1 0 0,0-1 0,0-1 0,0 0 0,0 0 0,-1-1 0,1 0 0,-1-1 0,17-13 0,-16 9 0,-2 1 0,1-2 0,-1 1 0,0-2 0,-1 1 0,-1-1 0,0 0 0,0 0 0,-1-1 0,-1 0 0,0 0 0,0-1 0,-2 1 0,0-1 0,0 0 0,1-27 0,-14 61 0,-4 19 0,8-15 0,-2 6 0,1 0 0,1 1 0,-3 56 0,9-110 0,1 1 0,2 0 0,0 0 0,7-27 0,-7 36 0,2 0 0,-1 0 0,1 0 0,1 1 0,0 0 0,1 0 0,1 1 0,14-19 0,-21 29-105,0 0 0,0 0 0,1-1 0,-1 1 0,0 0 0,1 0 0,-1 1 0,0-1 0,1 0 0,-1 0 0,1 1 0,2-2 0</inkml:trace>
+</inkml:ink>
+</file>
+
+<file path=word/ink/ink24.xml><?xml version="1.0" encoding="utf-8"?>
+<inkml:ink xmlns:inkml="http://www.w3.org/2003/InkML">
+  <inkml:definitions>
+    <inkml:context xml:id="ctx0">
+      <inkml:inkSource xml:id="inkSrc0">
+        <inkml:traceFormat>
+          <inkml:channel name="X" type="integer" min="-2.14748E9" max="2.14748E9" units="cm"/>
+          <inkml:channel name="Y" type="integer" min="-2.14748E9" max="2.14748E9" units="cm"/>
+          <inkml:channel name="F" type="integer" max="32767" units="dev"/>
+        </inkml:traceFormat>
+        <inkml:channelProperties>
+          <inkml:channelProperty channel="X" name="resolution" value="1000" units="1/cm"/>
+          <inkml:channelProperty channel="Y" name="resolution" value="1000" units="1/cm"/>
+          <inkml:channelProperty channel="F" name="resolution" value="0" units="1/dev"/>
+        </inkml:channelProperties>
+      </inkml:inkSource>
+      <inkml:timestamp xml:id="ts0" timeString="2026-07-10T14:21:17.947"/>
+    </inkml:context>
+    <inkml:brush xml:id="br0">
+      <inkml:brushProperty name="width" value="0.035" units="cm"/>
+      <inkml:brushProperty name="height" value="0.035" units="cm"/>
+    </inkml:brush>
+  </inkml:definitions>
+  <inkml:trace contextRef="#ctx0" brushRef="#br0">1 18 24575,'0'32'0,"1"-1"0,9 50 0,-7-67 0,1 0 0,0 0 0,1-1 0,0 1 0,1-1 0,0-1 0,1 1 0,10 12 0,-16-24 0,-1 0 0,1 0 0,0 0 0,0 0 0,0 0 0,0 0 0,0 0 0,0 0 0,0 0 0,0 0 0,1-1 0,-1 1 0,0-1 0,0 1 0,1 0 0,-1-1 0,0 0 0,1 1 0,-1-1 0,0 0 0,1 0 0,-1 0 0,0 0 0,1 0 0,-1 0 0,1 0 0,-1 0 0,0-1 0,1 1 0,-1 0 0,0-1 0,0 1 0,1-1 0,-1 1 0,0-1 0,0 0 0,0 0 0,1 1 0,-1-1 0,0 0 0,0 0 0,0 0 0,0 0 0,-1 0 0,2-2 0,7-7 0,-1 0 0,-1-1 0,12-21 0,-13 22 0,98-199-1365,-97 197-5461</inkml:trace>
+</inkml:ink>
+</file>
+
+<file path=word/ink/ink25.xml><?xml version="1.0" encoding="utf-8"?>
+<inkml:ink xmlns:inkml="http://www.w3.org/2003/InkML">
+  <inkml:definitions>
+    <inkml:context xml:id="ctx0">
+      <inkml:inkSource xml:id="inkSrc0">
+        <inkml:traceFormat>
+          <inkml:channel name="X" type="integer" min="-2.14748E9" max="2.14748E9" units="cm"/>
+          <inkml:channel name="Y" type="integer" min="-2.14748E9" max="2.14748E9" units="cm"/>
+          <inkml:channel name="F" type="integer" max="32767" units="dev"/>
+        </inkml:traceFormat>
+        <inkml:channelProperties>
+          <inkml:channelProperty channel="X" name="resolution" value="1000" units="1/cm"/>
+          <inkml:channelProperty channel="Y" name="resolution" value="1000" units="1/cm"/>
+          <inkml:channelProperty channel="F" name="resolution" value="0" units="1/dev"/>
+        </inkml:channelProperties>
+      </inkml:inkSource>
+      <inkml:timestamp xml:id="ts0" timeString="2026-07-10T14:21:18.261"/>
+    </inkml:context>
+    <inkml:brush xml:id="br0">
+      <inkml:brushProperty name="width" value="0.035" units="cm"/>
+      <inkml:brushProperty name="height" value="0.035" units="cm"/>
+    </inkml:brush>
+  </inkml:definitions>
+  <inkml:trace contextRef="#ctx0" brushRef="#br0">1 1 24575,'0'20'0,"1"0"0,1-1 0,1 1 0,0 0 0,2-1 0,0 1 0,1-1 0,15 30 0,-21-49-57,0 1 0,0-1 1,1 1-1,-1 0 0,0-1 0,1 1 0,-1-1 0,0 1 0,1-1 0,-1 1 0,1-1 1,-1 0-1,1 1 0,-1-1 0,1 1 0,-1-1 0,1 0 0,-1 0 0,1 1 1,-1-1-1,1 0 0,0 0 0,0 1 0</inkml:trace>
+</inkml:ink>
+</file>
+
+<file path=word/ink/ink26.xml><?xml version="1.0" encoding="utf-8"?>
+<inkml:ink xmlns:inkml="http://www.w3.org/2003/InkML">
+  <inkml:definitions>
+    <inkml:context xml:id="ctx0">
+      <inkml:inkSource xml:id="inkSrc0">
+        <inkml:traceFormat>
+          <inkml:channel name="X" type="integer" min="-2.14748E9" max="2.14748E9" units="cm"/>
+          <inkml:channel name="Y" type="integer" min="-2.14748E9" max="2.14748E9" units="cm"/>
+          <inkml:channel name="F" type="integer" max="32767" units="dev"/>
+        </inkml:traceFormat>
+        <inkml:channelProperties>
+          <inkml:channelProperty channel="X" name="resolution" value="1000" units="1/cm"/>
+          <inkml:channelProperty channel="Y" name="resolution" value="1000" units="1/cm"/>
+          <inkml:channelProperty channel="F" name="resolution" value="0" units="1/dev"/>
+        </inkml:channelProperties>
+      </inkml:inkSource>
+      <inkml:timestamp xml:id="ts0" timeString="2026-07-10T14:21:18.421"/>
+    </inkml:context>
+    <inkml:brush xml:id="br0">
+      <inkml:brushProperty name="width" value="0.035" units="cm"/>
+      <inkml:brushProperty name="height" value="0.035" units="cm"/>
+    </inkml:brush>
+  </inkml:definitions>
+  <inkml:trace contextRef="#ctx0" brushRef="#br0">0 0 24575,'0'0'0,"1"3"0,2 1 0,0 1 0</inkml:trace>
+</inkml:ink>
+</file>
+
+<file path=word/ink/ink27.xml><?xml version="1.0" encoding="utf-8"?>
+<inkml:ink xmlns:inkml="http://www.w3.org/2003/InkML">
+  <inkml:definitions>
+    <inkml:context xml:id="ctx0">
+      <inkml:inkSource xml:id="inkSrc0">
+        <inkml:traceFormat>
+          <inkml:channel name="X" type="integer" min="-2.14748E9" max="2.14748E9" units="cm"/>
+          <inkml:channel name="Y" type="integer" min="-2.14748E9" max="2.14748E9" units="cm"/>
+          <inkml:channel name="F" type="integer" max="32767" units="dev"/>
+        </inkml:traceFormat>
+        <inkml:channelProperties>
+          <inkml:channelProperty channel="X" name="resolution" value="1000" units="1/cm"/>
+          <inkml:channelProperty channel="Y" name="resolution" value="1000" units="1/cm"/>
+          <inkml:channelProperty channel="F" name="resolution" value="0" units="1/dev"/>
+        </inkml:channelProperties>
+      </inkml:inkSource>
+      <inkml:timestamp xml:id="ts0" timeString="2026-07-10T14:21:19.507"/>
+    </inkml:context>
+    <inkml:brush xml:id="br0">
+      <inkml:brushProperty name="width" value="0.035" units="cm"/>
+      <inkml:brushProperty name="height" value="0.035" units="cm"/>
+    </inkml:brush>
+  </inkml:definitions>
+  <inkml:trace contextRef="#ctx0" brushRef="#br0">0 113 24575,'9'11'0,"0"0"0,-1 1 0,0 0 0,-1 0 0,-1 0 0,0 1 0,-1 0 0,0 0 0,4 17 0,-4-13 0,0 0 0,2 0 0,0-1 0,17 28 0,-24-44 0,0 0 0,0 0 0,1 1 0,-1-1 0,0 0 0,0 0 0,0 0 0,1 0 0,-1 0 0,0 0 0,0 0 0,0 0 0,1 0 0,-1 0 0,0 0 0,0 0 0,1 0 0,-1 0 0,0 0 0,0 0 0,0 0 0,1 0 0,-1 0 0,0-1 0,0 1 0,0 0 0,0 0 0,1 0 0,-1 0 0,0 0 0,0 0 0,0-1 0,0 1 0,0 0 0,1 0 0,-1 0 0,0 0 0,0-1 0,0 1 0,0 0 0,0 0 0,0 0 0,0-1 0,0 1 0,0 0 0,0 0 0,0 0 0,0-1 0,0 1 0,0 0 0,0 0 0,0 0 0,0-1 0,0 1 0,6-18 0,-5 14 0,28-135 0,-20 89 0,19-65 0,-28 114 0,1 0 0,-1 1 0,0-1 0,0 0 0,0 1 0,0-1 0,0 1 0,1-1 0,-1 0 0,0 1 0,0-1 0,1 1 0,-1-1 0,0 1 0,1-1 0,-1 1 0,1-1 0,-1 1 0,1 0 0,-1-1 0,1 1 0,-1-1 0,1 1 0,-1 0 0,1 0 0,-1-1 0,1 1 0,0 0 0,-1 0 0,1 0 0,-1-1 0,1 1 0,0 0 0,-1 0 0,1 0 0,0 0 0,0 0 0,21 16 0,-6-3 0,-6-8 0,1 0 0,-1 0 0,1-1 0,0 0 0,1-1 0,-1 0 0,23 2 0,-29-5 0,0 1 0,0-1 0,0 0 0,0 0 0,0 0 0,0-1 0,0 0 0,0 0 0,0 0 0,0 0 0,0-1 0,0 0 0,-1 0 0,1 0 0,-1-1 0,1 0 0,-1 0 0,0 0 0,0 0 0,5-5 0,-8 7 0,-1 0 0,1 1 0,0-1 0,0 0 0,-1 0 0,1 1 0,-1-1 0,1 0 0,-1 0 0,1 0 0,-1 0 0,1 0 0,-1 1 0,0-1 0,0 0 0,1 0 0,-1 0 0,0 0 0,0 0 0,0 0 0,0 0 0,0 0 0,0 0 0,0 0 0,-1 0 0,1 0 0,0 0 0,0 0 0,-1 0 0,1 0 0,0 0 0,-1 0 0,1 1 0,-1-1 0,0 0 0,1 0 0,-1 0 0,1 1 0,-1-1 0,0 0 0,0 1 0,1-1 0,-1 1 0,0-1 0,-1 0 0,-1 0 0,1 0 0,0 0 0,0 1 0,-1-1 0,1 1 0,0-1 0,0 1 0,-1 0 0,1 0 0,-1 0 0,1 0 0,0 0 0,-1 1 0,1-1 0,0 1 0,0 0 0,-1-1 0,-3 3 0,2 0 0,1 0 0,-1 0 0,0 0 0,1 1 0,0-1 0,0 1 0,0 0 0,0-1 0,1 2 0,-1-1 0,1 0 0,0 0 0,0 1 0,1-1 0,0 1 0,-1-1 0,1 1 0,1 0 0,-1-1 0,0 10 0,1-5 0,0 0 0,0 0 0,1 0 0,0 1 0,1-1 0,0-1 0,0 1 0,1 0 0,8 16 0,-6-16-72,0-1 1,1 0-1,0-1 0,0 1 0,1-1 0,0-1 0,0 1 0,0-1 1,1 0-1,0-1 0,1 0 0,-1 0 0,1 0 0,0-1 0,0-1 1,0 0-1,0 0 0,11 2 0,-8-4-6754</inkml:trace>
+</inkml:ink>
+</file>
+
+<file path=word/ink/ink28.xml><?xml version="1.0" encoding="utf-8"?>
+<inkml:ink xmlns:inkml="http://www.w3.org/2003/InkML">
+  <inkml:definitions>
+    <inkml:context xml:id="ctx0">
+      <inkml:inkSource xml:id="inkSrc0">
+        <inkml:traceFormat>
+          <inkml:channel name="X" type="integer" min="-2.14748E9" max="2.14748E9" units="cm"/>
+          <inkml:channel name="Y" type="integer" min="-2.14748E9" max="2.14748E9" units="cm"/>
+          <inkml:channel name="F" type="integer" max="32767" units="dev"/>
+        </inkml:traceFormat>
+        <inkml:channelProperties>
+          <inkml:channelProperty channel="X" name="resolution" value="1000" units="1/cm"/>
+          <inkml:channelProperty channel="Y" name="resolution" value="1000" units="1/cm"/>
+          <inkml:channelProperty channel="F" name="resolution" value="0" units="1/dev"/>
+        </inkml:channelProperties>
+      </inkml:inkSource>
+      <inkml:timestamp xml:id="ts0" timeString="2026-07-10T14:21:20.028"/>
+    </inkml:context>
+    <inkml:brush xml:id="br0">
+      <inkml:brushProperty name="width" value="0.035" units="cm"/>
+      <inkml:brushProperty name="height" value="0.035" units="cm"/>
+    </inkml:brush>
+  </inkml:definitions>
+  <inkml:trace contextRef="#ctx0" brushRef="#br0">337 0 24575,'-14'25'0,"-95"146"0,36-60 0,45-66-107,-79 135-1151,101-168-5568</inkml:trace>
+</inkml:ink>
+</file>
+
+<file path=word/ink/ink29.xml><?xml version="1.0" encoding="utf-8"?>
+<inkml:ink xmlns:inkml="http://www.w3.org/2003/InkML">
+  <inkml:definitions>
+    <inkml:context xml:id="ctx0">
+      <inkml:inkSource xml:id="inkSrc0">
+        <inkml:traceFormat>
+          <inkml:channel name="X" type="integer" min="-2.14748E9" max="2.14748E9" units="cm"/>
+          <inkml:channel name="Y" type="integer" min="-2.14748E9" max="2.14748E9" units="cm"/>
+          <inkml:channel name="F" type="integer" max="32767" units="dev"/>
+        </inkml:traceFormat>
+        <inkml:channelProperties>
+          <inkml:channelProperty channel="X" name="resolution" value="1000" units="1/cm"/>
+          <inkml:channelProperty channel="Y" name="resolution" value="1000" units="1/cm"/>
+          <inkml:channelProperty channel="F" name="resolution" value="0" units="1/dev"/>
+        </inkml:channelProperties>
+      </inkml:inkSource>
+      <inkml:timestamp xml:id="ts0" timeString="2026-07-10T14:21:22.544"/>
+    </inkml:context>
+    <inkml:brush xml:id="br0">
+      <inkml:brushProperty name="width" value="0.035" units="cm"/>
+      <inkml:brushProperty name="height" value="0.035" units="cm"/>
+    </inkml:brush>
+  </inkml:definitions>
+  <inkml:trace contextRef="#ctx0" brushRef="#br0">370 25 24559,'2'3'0,"-1"0"0,-1 0 0,0 0 0,1 0 0,-2 1 0,1-1 0,-1 1 0,0-1 0,-1 1 0,1 0 0,-1 0 0,0 0 0,-1 0 0,0 1 0,0-1 0,0 0 0,0 1 0,-1-1 0,0 0 0,-1 1 0,1-1 0,-1 1 0,0-1 0,0 1 0,0-1 0,-1 0 0,1 1 0,-1-1 0,0 1 0,-1-1 0,1 0 0,-1 0 0,1 0 0,-1 0 0,0 0 0,0 0 0,0 0 0,0 0 0,0-1 0,0 1 0,-1-1 0,1 0 0,0 1 0,-1-1 0,1-1 0,0 1 0,-1 0 0,1-1 0,0 0 0,0 1 0,0-1 0,0-1 0,0 1 0,0 0 0,0-1 0,1 0 0,-1 0 0,1 0 0,0 0 0,0-1 0,0 0 0,1 1 0,-1-2 0,1 1 0,0 0 0,0-1 0,1 1 0,-1-1 0,1 0 0,0-1 0,1 1 0,-1-1 0,1 1 0,0-1 0,1 0 0,-1-1 0,1 1 0,1-1 0,-1 1 0,1-1 0,0 0 0,0 0 0,1 0 0,0-1 0,0 1 0,1 0 0,0-1 0,0 0 0,0 0 0,1 0 0,0 0 0,0 0 0,0 0 0,1 0 0,0 0 0,1-1 0,-1 1 0,1 0 0,0-1 0,0 1 0,1-1 0,-1 1 0,1-1 0,0 1 0,1 0 0,-1-1 0,1 1 0,0-1 0,0 1 0,0 0 0,1-1 0,-1 1 0,1 0 0,0 0 0,-1 0 0,1 0 0,0 1 0,1-1 0,-1 0 0,0 1 0,0-1 0,1 1 0,-1 0 0,0 0 0,1 0 0,-1 0 0,0 1 0,0-1 0,1 1 0,-1 0 0,0 0 0,0 0 0,0 0 0,-1 1 0,1 0 0,0-1 0,-1 1 0,0 1 0,1-1 0,-2 0 0,1 1 0,0 0 0,-1 0 0,1 0 0,-1 1 0,-1-1 0,1 1 0,-1 0 0,0 0 0,0 0 0,0 1 0,-1-1 0,0 1 0,0 0 0,0 0 0,-1 0 0,0 1 0,0-1 0,-1 1 0</inkml:trace>
+</inkml:ink>
+</file>
+
+<file path=word/ink/ink3.xml><?xml version="1.0" encoding="utf-8"?>
+<inkml:ink xmlns:inkml="http://www.w3.org/2003/InkML">
+  <inkml:definitions>
+    <inkml:context xml:id="ctx0">
+      <inkml:inkSource xml:id="inkSrc0">
+        <inkml:traceFormat>
+          <inkml:channel name="X" type="integer" min="-2.14748E9" max="2.14748E9" units="cm"/>
+          <inkml:channel name="Y" type="integer" min="-2.14748E9" max="2.14748E9" units="cm"/>
+          <inkml:channel name="F" type="integer" max="32767" units="dev"/>
+        </inkml:traceFormat>
+        <inkml:channelProperties>
+          <inkml:channelProperty channel="X" name="resolution" value="1000" units="1/cm"/>
+          <inkml:channelProperty channel="Y" name="resolution" value="1000" units="1/cm"/>
+          <inkml:channelProperty channel="F" name="resolution" value="0" units="1/dev"/>
+        </inkml:channelProperties>
+      </inkml:inkSource>
+      <inkml:timestamp xml:id="ts0" timeString="2026-07-10T14:20:38.364"/>
+    </inkml:context>
+    <inkml:brush xml:id="br0">
+      <inkml:brushProperty name="width" value="0.035" units="cm"/>
+      <inkml:brushProperty name="height" value="0.035" units="cm"/>
+    </inkml:brush>
+  </inkml:definitions>
+  <inkml:trace contextRef="#ctx0" brushRef="#br0">1 8 24575,'0'0'0,"0"0"0,0 0 0,0 0 0,1 0 0,3-1 0,5-1 0,8 1 0,8 0 0,4 0 0,0 0 0,0 1 0,2 0 0,-1 0 0,-6 0 0,-6 0-8191</inkml:trace>
+</inkml:ink>
+</file>
+
+<file path=word/ink/ink30.xml><?xml version="1.0" encoding="utf-8"?>
+<inkml:ink xmlns:inkml="http://www.w3.org/2003/InkML">
+  <inkml:definitions>
+    <inkml:context xml:id="ctx0">
+      <inkml:inkSource xml:id="inkSrc0">
+        <inkml:traceFormat>
+          <inkml:channel name="X" type="integer" min="-2.14748E9" max="2.14748E9" units="cm"/>
+          <inkml:channel name="Y" type="integer" min="-2.14748E9" max="2.14748E9" units="cm"/>
+          <inkml:channel name="F" type="integer" max="32767" units="dev"/>
+        </inkml:traceFormat>
+        <inkml:channelProperties>
+          <inkml:channelProperty channel="X" name="resolution" value="1000" units="1/cm"/>
+          <inkml:channelProperty channel="Y" name="resolution" value="1000" units="1/cm"/>
+          <inkml:channelProperty channel="F" name="resolution" value="0" units="1/dev"/>
+        </inkml:channelProperties>
+      </inkml:inkSource>
+      <inkml:timestamp xml:id="ts0" timeString="2026-07-10T14:21:26.703"/>
+    </inkml:context>
+    <inkml:brush xml:id="br0">
+      <inkml:brushProperty name="width" value="0.035" units="cm"/>
+      <inkml:brushProperty name="height" value="0.035" units="cm"/>
+    </inkml:brush>
+  </inkml:definitions>
+  <inkml:trace contextRef="#ctx0" brushRef="#br0">311 0 24575,'0'0'0,"0"0"0,0 0 0,0 0 0,0 0 0,0 0 0,-1 1 0,1-1 0,-1 1 0,0 0 0,0-1 0,0 1 0,1 0 0,-1-1 0,0 1 0,1 0 0,-1 0 0,1-1 0,-1 1 0,1 0 0,-1 0 0,1 0 0,-1 0 0,1 0 0,0 0 0,0 0 0,-1 0 0,1 0 0,0 0 0,0 0 0,0 0 0,0 0 0,0 1 0,-1 29 0,4-5 0,1-1 0,2 1 0,0 0 0,1-1 0,20 43 0,12 43 0,-33-91 0,-2 1 0,0 0 0,-2 0 0,0 0 0,-1 1 0,-2-1 0,-2 25 0,1-35 0,0 0 0,0 0 0,-1-1 0,0 1 0,-1-1 0,-1 0 0,1 0 0,-2 0 0,1-1 0,-1 0 0,0 0 0,-1 0 0,0-1 0,-1 0 0,-13 12 0,8-11-72,0 0 1,0-1-1,-1 0 0,0-1 0,0-1 0,0 0 0,-1-1 0,0 0 1,0-2-1,-1 0 0,1 0 0,-1-1 0,1-1 0,-1-1 0,0 0 1,1-1-1,-1-1 0,-20-4 0,23 3-6754</inkml:trace>
+</inkml:ink>
+</file>
+
+<file path=word/ink/ink31.xml><?xml version="1.0" encoding="utf-8"?>
+<inkml:ink xmlns:inkml="http://www.w3.org/2003/InkML">
+  <inkml:definitions>
+    <inkml:context xml:id="ctx0">
+      <inkml:inkSource xml:id="inkSrc0">
+        <inkml:traceFormat>
+          <inkml:channel name="X" type="integer" min="-2.14748E9" max="2.14748E9" units="cm"/>
+          <inkml:channel name="Y" type="integer" min="-2.14748E9" max="2.14748E9" units="cm"/>
+          <inkml:channel name="F" type="integer" max="32767" units="dev"/>
+        </inkml:traceFormat>
+        <inkml:channelProperties>
+          <inkml:channelProperty channel="X" name="resolution" value="1000" units="1/cm"/>
+          <inkml:channelProperty channel="Y" name="resolution" value="1000" units="1/cm"/>
+          <inkml:channelProperty channel="F" name="resolution" value="0" units="1/dev"/>
+        </inkml:channelProperties>
+      </inkml:inkSource>
+      <inkml:timestamp xml:id="ts0" timeString="2026-07-10T14:21:27.601"/>
+    </inkml:context>
+    <inkml:brush xml:id="br0">
+      <inkml:brushProperty name="width" value="0.035" units="cm"/>
+      <inkml:brushProperty name="height" value="0.035" units="cm"/>
+    </inkml:brush>
+  </inkml:definitions>
+  <inkml:trace contextRef="#ctx0" brushRef="#br0">0 240 24575,'7'21'0,"-2"-17"0,-3-16 0,-4-34 0,1 28 0,0 0 0,1 1 0,1-1 0,0 0 0,5-18 0,-4 32 6,0-1-1,0 1 1,0 0-1,0 0 0,1 0 1,0 0-1,0 1 1,0-1-1,0 1 1,0 0-1,1-1 1,0 2-1,-1-1 0,1 0 1,0 1-1,0-1 1,0 1-1,1 0 1,-1 1-1,1-1 1,4 0-1,6-2-253,0 0 1,1 2-1,-1 0 1,0 1-1,18 0 1,-21 2-6579</inkml:trace>
+</inkml:ink>
+</file>
+
+<file path=word/ink/ink32.xml><?xml version="1.0" encoding="utf-8"?>
+<inkml:ink xmlns:inkml="http://www.w3.org/2003/InkML">
+  <inkml:definitions>
+    <inkml:context xml:id="ctx0">
+      <inkml:inkSource xml:id="inkSrc0">
+        <inkml:traceFormat>
+          <inkml:channel name="X" type="integer" min="-2.14748E9" max="2.14748E9" units="cm"/>
+          <inkml:channel name="Y" type="integer" min="-2.14748E9" max="2.14748E9" units="cm"/>
+          <inkml:channel name="F" type="integer" max="32767" units="dev"/>
+        </inkml:traceFormat>
+        <inkml:channelProperties>
+          <inkml:channelProperty channel="X" name="resolution" value="1000" units="1/cm"/>
+          <inkml:channelProperty channel="Y" name="resolution" value="1000" units="1/cm"/>
+          <inkml:channelProperty channel="F" name="resolution" value="0" units="1/dev"/>
+        </inkml:channelProperties>
+      </inkml:inkSource>
+      <inkml:timestamp xml:id="ts0" timeString="2026-07-10T14:21:28.422"/>
+    </inkml:context>
+    <inkml:brush xml:id="br0">
+      <inkml:brushProperty name="width" value="0.035" units="cm"/>
+      <inkml:brushProperty name="height" value="0.035" units="cm"/>
+    </inkml:brush>
+  </inkml:definitions>
+  <inkml:trace contextRef="#ctx0" brushRef="#br0">259 0 24575,'-32'0'0,"14"1"0,-1-1 0,1 2 0,-1 1 0,1 0 0,0 1 0,-20 8 0,32-10 0,0 0 0,1 1 0,0 0 0,-1 0 0,1 0 0,0 1 0,1 0 0,-1 0 0,1 0 0,-5 5 0,7-6 0,0 1 0,-1-1 0,2 1 0,-1-1 0,0 1 0,1-1 0,0 1 0,-1 0 0,2 0 0,-1 0 0,0 0 0,1 0 0,0 0 0,-1 0 0,2-1 0,0 9 0,0-8 0,0 1 0,1-1 0,-1 0 0,1 0 0,0 0 0,0 0 0,0 0 0,1-1 0,0 1 0,-1-1 0,1 0 0,0 1 0,0-1 0,1 0 0,-1-1 0,1 1 0,-1-1 0,1 1 0,0-1 0,0 0 0,0-1 0,0 1 0,0-1 0,1 1 0,3 0 0,9 2 0,0-1 0,-1 0 0,1-1 0,0-1 0,20-1 0,-19-1 0,0-1 0,20-4 0,-31 5 0,0-1 0,-1 0 0,1 0 0,0-1 0,-1 0 0,0 0 0,0 0 0,9-7 0,-14 9 0,0 0 0,-1 0 0,1 0 0,0 0 0,-1 0 0,1 0 0,-1 0 0,0 0 0,1 0 0,-1 0 0,0 0 0,0 0 0,1-1 0,-1 1 0,0 0 0,0 0 0,0 0 0,0 0 0,-1 0 0,1 0 0,0 0 0,0-1 0,-1 1 0,1 0 0,0 0 0,-1 0 0,1 0 0,-1 0 0,0 0 0,1 1 0,-1-1 0,0 0 0,1 0 0,-1 0 0,0 0 0,0 1 0,-1-2 0,-33-28 0,-89-45-1365</inkml:trace>
+</inkml:ink>
+</file>
+
+<file path=word/ink/ink33.xml><?xml version="1.0" encoding="utf-8"?>
+<inkml:ink xmlns:inkml="http://www.w3.org/2003/InkML">
+  <inkml:definitions>
+    <inkml:context xml:id="ctx0">
+      <inkml:inkSource xml:id="inkSrc0">
+        <inkml:traceFormat>
+          <inkml:channel name="X" type="integer" min="-2.14748E9" max="2.14748E9" units="cm"/>
+          <inkml:channel name="Y" type="integer" min="-2.14748E9" max="2.14748E9" units="cm"/>
+          <inkml:channel name="F" type="integer" max="32767" units="dev"/>
+        </inkml:traceFormat>
+        <inkml:channelProperties>
+          <inkml:channelProperty channel="X" name="resolution" value="1000" units="1/cm"/>
+          <inkml:channelProperty channel="Y" name="resolution" value="1000" units="1/cm"/>
+          <inkml:channelProperty channel="F" name="resolution" value="0" units="1/dev"/>
+        </inkml:channelProperties>
+      </inkml:inkSource>
+      <inkml:timestamp xml:id="ts0" timeString="2026-07-10T14:21:29.343"/>
+    </inkml:context>
+    <inkml:brush xml:id="br0">
+      <inkml:brushProperty name="width" value="0.035" units="cm"/>
+      <inkml:brushProperty name="height" value="0.035" units="cm"/>
+    </inkml:brush>
+  </inkml:definitions>
+  <inkml:trace contextRef="#ctx0" brushRef="#br0">0 228 24575,'1'5'0,"1"-1"0,0 1 0,0-1 0,0 0 0,0 1 0,1-1 0,0 0 0,0 0 0,0-1 0,6 7 0,-2-2 0,8 10 0,1-1 0,0-1 0,20 15 0,-28-25 0,0 0 0,1 0 0,0-1 0,0 0 0,0 0 0,1-1 0,-1-1 0,1 1 0,13 1 0,-22-5 0,1 0 0,-1 0 0,1 0 0,0 0 0,-1 0 0,1-1 0,0 1 0,-1 0 0,1-1 0,-1 0 0,1 1 0,-1-1 0,1 0 0,-1 0 0,0 0 0,1 0 0,-1 0 0,0 0 0,1 0 0,-1 0 0,0 0 0,0-1 0,0 1 0,0 0 0,-1-1 0,1 1 0,0-1 0,1-2 0,2-7 0,0 1 0,0-1 0,2-13 0,-2 7 0,0 4 0,-2 8 0,0 0 0,0-1 0,-1 1 0,0 0 0,0-1 0,0 1 0,0-1 0,-1 1 0,0-1 0,-1-8 0,7 23 0,-1-1 0,1 0 0,1 0 0,-1-1 0,1 1 0,0-2 0,9 8 0,-5-5 0,-2-1 0,2 0 0,-1 0 0,1-1 0,0-1 0,0 0 0,23 9 0,-28-12 0,1-1 0,-1-1 0,1 1 0,-1-1 0,1 0 0,0 0 0,-1-1 0,1 0 0,0 0 0,0-1 0,-1 1 0,1-2 0,0 1 0,11-5 0,-15 5 0,-1-1 0,0 1 0,0-1 0,0 0 0,1 0 0,-2 0 0,1 0 0,0 0 0,0 0 0,-1-1 0,1 1 0,-1-1 0,0 1 0,0-1 0,1 1 0,-2-1 0,1 0 0,0 1 0,-1-1 0,1 0 0,-1 0 0,0 0 0,0 1 0,0-1 0,0 0 0,0 0 0,-1-4 0,-2-8 0,1-1 0,-2 1 0,-7-23 0,-5-1-112,-1 0 0,-34-53 0,31 58-917,12 19-5797</inkml:trace>
+</inkml:ink>
+</file>
+
+<file path=word/ink/ink4.xml><?xml version="1.0" encoding="utf-8"?>
+<inkml:ink xmlns:inkml="http://www.w3.org/2003/InkML">
+  <inkml:definitions>
+    <inkml:context xml:id="ctx0">
+      <inkml:inkSource xml:id="inkSrc0">
+        <inkml:traceFormat>
+          <inkml:channel name="X" type="integer" min="-2.14748E9" max="2.14748E9" units="cm"/>
+          <inkml:channel name="Y" type="integer" min="-2.14748E9" max="2.14748E9" units="cm"/>
+          <inkml:channel name="F" type="integer" max="32767" units="dev"/>
+        </inkml:traceFormat>
+        <inkml:channelProperties>
+          <inkml:channelProperty channel="X" name="resolution" value="1000" units="1/cm"/>
+          <inkml:channelProperty channel="Y" name="resolution" value="1000" units="1/cm"/>
+          <inkml:channelProperty channel="F" name="resolution" value="0" units="1/dev"/>
+        </inkml:channelProperties>
+      </inkml:inkSource>
+      <inkml:timestamp xml:id="ts0" timeString="2026-07-10T14:20:39.450"/>
+    </inkml:context>
+    <inkml:brush xml:id="br0">
+      <inkml:brushProperty name="width" value="0.035" units="cm"/>
+      <inkml:brushProperty name="height" value="0.035" units="cm"/>
+    </inkml:brush>
+  </inkml:definitions>
+  <inkml:trace contextRef="#ctx0" brushRef="#br0">0 68 24575,'0'0'0,"0"52"0,9 63 0,-7-99 0,1 0 0,0-1 0,1 1 0,1-1 0,1 0 0,0-1 0,0 1 0,13 18 0,-17-30 0,0 1 0,1-1 0,-1 0 0,1 0 0,0 0 0,0-1 0,0 1 0,0-1 0,0 1 0,0-1 0,1 0 0,-1 0 0,1-1 0,0 1 0,-1-1 0,1 0 0,0 1 0,0-2 0,0 1 0,0 0 0,0-1 0,0 0 0,0 0 0,0 0 0,-1 0 0,1-1 0,0 1 0,0-1 0,0 0 0,0-1 0,5-1 0,-1 0 0,-1-1 0,0 0 0,1-1 0,-2 1 0,1-1 0,0-1 0,-1 1 0,0-1 0,0 0 0,-1 0 0,0-1 0,0 0 0,0 0 0,3-7 0,-2 1 0,-1 1 0,0 0 0,-1-1 0,0 0 0,-2 0 0,1 0 0,-1-1 0,-1 1 0,0 0 0,-1-1 0,-3-19 0,2 25 0,0-1 0,-1 1 0,0 0 0,-1 0 0,0 0 0,0 0 0,-1 0 0,0 0 0,0 1 0,-1 0 0,0 0 0,0 0 0,-1 1 0,1-1 0,-1 1 0,-1 1 0,1-1 0,-1 1 0,-8-5 0,11 8 8,-1 0-1,1 0 1,0 0-1,0 0 1,-1 1-1,1 0 1,-1 0-1,1 0 1,-1 1-1,0-1 1,1 1-1,-1 0 1,0 0-1,1 1 1,-9 1-1,4 0-193,1 1 1,0 0-1,0 1 0,0 0 1,0 0-1,1 1 1,-11 7-1,-2 4-6640</inkml:trace>
+</inkml:ink>
+</file>
+
+<file path=word/ink/ink5.xml><?xml version="1.0" encoding="utf-8"?>
+<inkml:ink xmlns:inkml="http://www.w3.org/2003/InkML">
+  <inkml:definitions>
+    <inkml:context xml:id="ctx0">
+      <inkml:inkSource xml:id="inkSrc0">
+        <inkml:traceFormat>
+          <inkml:channel name="X" type="integer" min="-2.14748E9" max="2.14748E9" units="cm"/>
+          <inkml:channel name="Y" type="integer" min="-2.14748E9" max="2.14748E9" units="cm"/>
+          <inkml:channel name="F" type="integer" max="32767" units="dev"/>
+        </inkml:traceFormat>
+        <inkml:channelProperties>
+          <inkml:channelProperty channel="X" name="resolution" value="1000" units="1/cm"/>
+          <inkml:channelProperty channel="Y" name="resolution" value="1000" units="1/cm"/>
+          <inkml:channelProperty channel="F" name="resolution" value="0" units="1/dev"/>
+        </inkml:channelProperties>
+      </inkml:inkSource>
+      <inkml:timestamp xml:id="ts0" timeString="2026-07-10T14:20:42.159"/>
+    </inkml:context>
+    <inkml:brush xml:id="br0">
+      <inkml:brushProperty name="width" value="0.035" units="cm"/>
+      <inkml:brushProperty name="height" value="0.035" units="cm"/>
+    </inkml:brush>
+  </inkml:definitions>
+  <inkml:trace contextRef="#ctx0" brushRef="#br0">0 1 24575,'4'4'0,"0"-1"0,0 0 0,0 0 0,1-1 0,-1 1 0,1-1 0,0 0 0,-1 0 0,1 0 0,7 1 0,55 7 0,-34-7 0,96 10 0,178-7 0,-196-6 0,1342 45 0,-384-34 0,0-55 0,-862 33 0,790-14 0,-1 26 0,-300 2 0,1346 3 0,-624-16 0,-3 0 0,-54-3 0,-1353 13-151,-1 0-1,1 0 0,0-1 0,-1 0 1,1 0-1,-1-1 0,1 0 1,13-5-1</inkml:trace>
+</inkml:ink>
+</file>
+
+<file path=word/ink/ink6.xml><?xml version="1.0" encoding="utf-8"?>
+<inkml:ink xmlns:inkml="http://www.w3.org/2003/InkML">
+  <inkml:definitions>
+    <inkml:context xml:id="ctx0">
+      <inkml:inkSource xml:id="inkSrc0">
+        <inkml:traceFormat>
+          <inkml:channel name="X" type="integer" min="-2.14748E9" max="2.14748E9" units="cm"/>
+          <inkml:channel name="Y" type="integer" min="-2.14748E9" max="2.14748E9" units="cm"/>
+          <inkml:channel name="F" type="integer" max="32767" units="dev"/>
+        </inkml:traceFormat>
+        <inkml:channelProperties>
+          <inkml:channelProperty channel="X" name="resolution" value="1000" units="1/cm"/>
+          <inkml:channelProperty channel="Y" name="resolution" value="1000" units="1/cm"/>
+          <inkml:channelProperty channel="F" name="resolution" value="0" units="1/dev"/>
+        </inkml:channelProperties>
+      </inkml:inkSource>
+      <inkml:timestamp xml:id="ts0" timeString="2026-07-10T14:20:42.976"/>
+    </inkml:context>
+    <inkml:brush xml:id="br0">
+      <inkml:brushProperty name="width" value="0.035" units="cm"/>
+      <inkml:brushProperty name="height" value="0.035" units="cm"/>
+    </inkml:brush>
+  </inkml:definitions>
+  <inkml:trace contextRef="#ctx0" brushRef="#br0">1 0 24575,'0'0'0,"0"0"0,23 31 0,-19-16 0,0 0 0,-1 0 0,-1 0 0,0 1 0,-1-1 0,-1 1 0,-3 29 0,1 1 0,2 144 0,9 0 0,49 293 0,-6-155-1365,-49-306-5461</inkml:trace>
+</inkml:ink>
+</file>
+
+<file path=word/ink/ink7.xml><?xml version="1.0" encoding="utf-8"?>
+<inkml:ink xmlns:inkml="http://www.w3.org/2003/InkML">
+  <inkml:definitions>
+    <inkml:context xml:id="ctx0">
+      <inkml:inkSource xml:id="inkSrc0">
+        <inkml:traceFormat>
+          <inkml:channel name="X" type="integer" min="-2.14748E9" max="2.14748E9" units="cm"/>
+          <inkml:channel name="Y" type="integer" min="-2.14748E9" max="2.14748E9" units="cm"/>
+          <inkml:channel name="F" type="integer" max="32767" units="dev"/>
+        </inkml:traceFormat>
+        <inkml:channelProperties>
+          <inkml:channelProperty channel="X" name="resolution" value="1000" units="1/cm"/>
+          <inkml:channelProperty channel="Y" name="resolution" value="1000" units="1/cm"/>
+          <inkml:channelProperty channel="F" name="resolution" value="0" units="1/dev"/>
+        </inkml:channelProperties>
+      </inkml:inkSource>
+      <inkml:timestamp xml:id="ts0" timeString="2026-07-10T14:20:44.149"/>
+    </inkml:context>
+    <inkml:brush xml:id="br0">
+      <inkml:brushProperty name="width" value="0.035" units="cm"/>
+      <inkml:brushProperty name="height" value="0.035" units="cm"/>
+    </inkml:brush>
+  </inkml:definitions>
+  <inkml:trace contextRef="#ctx0" brushRef="#br0">5 0 24575,'0'0'0,"0"25"0,-2 86 0,-1-37 0,13 138 0,-7-191 0,1 0 0,1 1 0,0-1 0,2-1 0,0 1 0,1-1 0,1-1 0,1 0 0,1 0 0,26 34 0,-29-44-59,1 0 0,1-1-1,0 0 1,0-1-1,0 0 1,1 0 0,0-1-1,0-1 1,0 1 0,1-2-1,0 0 1,0 0 0,0-1-1,1-1 1,-1 0-1,0 0 1,1-2 0,0 1-1,-1-2 1,1 1 0,-1-2-1,18-3 1,-16 1-6767</inkml:trace>
+</inkml:ink>
+</file>
+
+<file path=word/ink/ink8.xml><?xml version="1.0" encoding="utf-8"?>
+<inkml:ink xmlns:inkml="http://www.w3.org/2003/InkML">
+  <inkml:definitions>
+    <inkml:context xml:id="ctx0">
+      <inkml:inkSource xml:id="inkSrc0">
+        <inkml:traceFormat>
+          <inkml:channel name="X" type="integer" min="-2.14748E9" max="2.14748E9" units="cm"/>
+          <inkml:channel name="Y" type="integer" min="-2.14748E9" max="2.14748E9" units="cm"/>
+          <inkml:channel name="F" type="integer" max="32767" units="dev"/>
+        </inkml:traceFormat>
+        <inkml:channelProperties>
+          <inkml:channelProperty channel="X" name="resolution" value="1000" units="1/cm"/>
+          <inkml:channelProperty channel="Y" name="resolution" value="1000" units="1/cm"/>
+          <inkml:channelProperty channel="F" name="resolution" value="0" units="1/dev"/>
+        </inkml:channelProperties>
+      </inkml:inkSource>
+      <inkml:timestamp xml:id="ts0" timeString="2026-07-10T14:20:44.598"/>
+    </inkml:context>
+    <inkml:brush xml:id="br0">
+      <inkml:brushProperty name="width" value="0.035" units="cm"/>
+      <inkml:brushProperty name="height" value="0.035" units="cm"/>
+    </inkml:brush>
+  </inkml:definitions>
+  <inkml:trace contextRef="#ctx0" brushRef="#br0">0 46 24575,'50'-8'0,"-10"1"0,251-21-1365,-253 25-5461</inkml:trace>
+</inkml:ink>
+</file>
+
+<file path=word/ink/ink9.xml><?xml version="1.0" encoding="utf-8"?>
+<inkml:ink xmlns:inkml="http://www.w3.org/2003/InkML">
+  <inkml:definitions>
+    <inkml:context xml:id="ctx0">
+      <inkml:inkSource xml:id="inkSrc0">
+        <inkml:traceFormat>
+          <inkml:channel name="X" type="integer" min="-2.14748E9" max="2.14748E9" units="cm"/>
+          <inkml:channel name="Y" type="integer" min="-2.14748E9" max="2.14748E9" units="cm"/>
+          <inkml:channel name="F" type="integer" max="32767" units="dev"/>
+        </inkml:traceFormat>
+        <inkml:channelProperties>
+          <inkml:channelProperty channel="X" name="resolution" value="1000" units="1/cm"/>
+          <inkml:channelProperty channel="Y" name="resolution" value="1000" units="1/cm"/>
+          <inkml:channelProperty channel="F" name="resolution" value="0" units="1/dev"/>
+        </inkml:channelProperties>
+      </inkml:inkSource>
+      <inkml:timestamp xml:id="ts0" timeString="2026-07-10T14:20:45.510"/>
+    </inkml:context>
+    <inkml:brush xml:id="br0">
+      <inkml:brushProperty name="width" value="0.035" units="cm"/>
+      <inkml:brushProperty name="height" value="0.035" units="cm"/>
+    </inkml:brush>
+  </inkml:definitions>
+  <inkml:trace contextRef="#ctx0" brushRef="#br0">1 49 24575,'0'0'0,"0"0"0,0 0 0,23-8 0,8-8 0,-23 12 0,-1 0 0,1 0 0,0 1 0,0 0 0,0 1 0,11-3 0,-17 7 0,0 0 0,0 1 0,0-1 0,0 1 0,0-1 0,0 1 0,-1 0 0,0 0 0,1-1 0,-1 1 0,1 5 0,-1-7 0,11 30-227,-2 1-1,0 0 1,-3 0-1,0 1 1,3 56-1</inkml:trace>
+</inkml:ink>
+</file>
+
 <file path=word/theme/theme1.xml><?xml version="1.0" encoding="utf-8"?>
 <a:theme xmlns:a="http://schemas.openxmlformats.org/drawingml/2006/main" name="Office Theme">
   <a:themeElements>

</xml_diff>